<commit_message>
Metodology, structure and some translation and correction
</commit_message>
<xml_diff>
--- a/Draft.CA1-Strategic Thinking- 20%.docx
+++ b/Draft.CA1-Strategic Thinking- 20%.docx
@@ -930,18 +930,6 @@
           <w:szCs w:val="22"/>
         </w:rPr>
       </w:pPr>
-    </w:p>
-    <w:p>
-      <w:pPr>
-        <w:bidi w:val="0"/>
-        <w:spacing w:line="240" w:lineRule="auto"/>
-        <w:jc w:val="both"/>
-        <w:rPr>
-          <w:rFonts w:hint="default" w:ascii="Arial" w:hAnsi="Arial" w:cs="Arial"/>
-          <w:sz w:val="22"/>
-          <w:szCs w:val="22"/>
-        </w:rPr>
-      </w:pPr>
       <w:r>
         <w:rPr>
           <w:rFonts w:hint="default" w:ascii="Arial" w:hAnsi="Arial" w:cs="Arial"/>
@@ -968,91 +956,135 @@
           <w:sz w:val="22"/>
           <w:szCs w:val="22"/>
         </w:rPr>
-        <w:t>In tehe</w:t>
-      </w:r>
-    </w:p>
-    <w:p>
-      <w:pPr>
-        <w:bidi w:val="0"/>
-        <w:spacing w:line="240" w:lineRule="auto"/>
-        <w:jc w:val="both"/>
+        <w:t>Currently, there are numerous models that classify content as hate or non-hate with considerable success. However, these models often lack explanatory power and a deep understanding, falling prey to typical problems such as shortcuts. For example, in training, many racist comments incorporate certain terms that are not inherently racist, but due to their frequency in racist comments, they are associated with racism through proximity. Similarly, the models tend to be very weak at understanding implicit language or longer texts. Finally, given these weaknesses, understanding the relationship between the context in which a hostile comment occurs and the comment itself is difficult with the existing tools.</w:t>
+      </w:r>
+    </w:p>
+    <w:p>
+      <w:pPr>
+        <w:bidi w:val="0"/>
+        <w:spacing w:line="240" w:lineRule="auto"/>
+        <w:jc w:val="both"/>
+        <w:rPr>
+          <w:rFonts w:hint="default" w:ascii="Arial" w:hAnsi="Arial" w:cs="Arial"/>
+          <w:sz w:val="22"/>
+          <w:szCs w:val="22"/>
+        </w:rPr>
+      </w:pPr>
+      <w:r>
+        <w:rPr>
+          <w:rFonts w:hint="default" w:ascii="Arial" w:hAnsi="Arial" w:cs="Arial"/>
+          <w:sz w:val="22"/>
+          <w:szCs w:val="22"/>
+        </w:rPr>
+        <w:t>Predictive NLP tools make processing and making sense of hostile, racist, or xenophobic posts and comments far more efficient. By evaluating a post right as it goes live (or even right before), these models can anticipate the likely nature and severity of the backlash it might trigger. Pinpointing these contextual triggers mathematically gives activist collectives like Sobremesa en Disidencia an early-warning mechanism to deploy targeted counter-narratives, while giving platforms actionable risk profiles to run proactive moderation.</w:t>
+      </w:r>
+    </w:p>
+    <w:p>
+      <w:pPr>
+        <w:numPr>
+          <w:ilvl w:val="0"/>
+          <w:numId w:val="1"/>
+        </w:numPr>
+        <w:bidi w:val="0"/>
+        <w:spacing w:line="240" w:lineRule="auto"/>
+        <w:jc w:val="both"/>
+        <w:rPr>
+          <w:rFonts w:hint="default" w:ascii="Arial" w:hAnsi="Arial" w:cs="Arial"/>
+          <w:sz w:val="22"/>
+          <w:szCs w:val="22"/>
+        </w:rPr>
+      </w:pPr>
+      <w:r>
         <w:rPr>
           <w:rFonts w:hint="default" w:ascii="Arial" w:hAnsi="Arial" w:cs="Arial"/>
           <w:sz w:val="22"/>
           <w:szCs w:val="22"/>
           <w:lang w:val="en-GB"/>
         </w:rPr>
-      </w:pPr>
-      <w:r>
-        <w:rPr>
-          <w:rFonts w:hint="default" w:ascii="Arial" w:hAnsi="Arial" w:cs="Arial"/>
-          <w:sz w:val="22"/>
-          <w:szCs w:val="22"/>
-        </w:rPr>
-        <w:t>Existen actualmente una gran cantidad de modelos que clasifica contenido como odio o no odio con un exito suficiente, sin embargo estos modelos</w:t>
-      </w:r>
-      <w:r>
+        <w:t>Aim and Objectives</w:t>
+      </w:r>
+    </w:p>
+    <w:p>
+      <w:pPr>
+        <w:bidi w:val="0"/>
+        <w:spacing w:line="240" w:lineRule="auto"/>
+        <w:jc w:val="both"/>
         <w:rPr>
           <w:rFonts w:hint="default" w:ascii="Arial" w:hAnsi="Arial" w:cs="Arial"/>
           <w:sz w:val="22"/>
           <w:szCs w:val="22"/>
           <w:lang w:val="en-GB"/>
         </w:rPr>
-        <w:t xml:space="preserve"> muchas veces carecen de explicabilidad y un entendimiendo pas profundo, cayendo en problemas tipicos como los atajos, por ejemplo en el entrenamiento muchos comentarios racistas incorporan ciertos terminos que en si no son racistas, pero por la frecuencia en que se encuentran en comentarios que si lo son, por proximidad los asocian a racismo. Asi mismo, los modelos suelen ser muy debiles al entender el lenguaje implicito o textos de mayor extencion. Por ultimo, dadas estas debilidades, entender relaciones entre el contexto en que un comentario hostil se produce y el comentario en si mismo, se hace dificil con las herramientas existentes.</w:t>
-      </w:r>
-    </w:p>
-    <w:p>
-      <w:pPr>
-        <w:bidi w:val="0"/>
-        <w:spacing w:line="240" w:lineRule="auto"/>
-        <w:jc w:val="both"/>
-        <w:rPr>
-          <w:rFonts w:hint="default" w:ascii="Arial" w:hAnsi="Arial" w:cs="Arial"/>
-          <w:sz w:val="22"/>
-          <w:szCs w:val="22"/>
-        </w:rPr>
-      </w:pPr>
-      <w:r>
-        <w:rPr>
-          <w:rFonts w:hint="default" w:ascii="Arial" w:hAnsi="Arial" w:cs="Arial"/>
-          <w:sz w:val="22"/>
-          <w:szCs w:val="22"/>
-        </w:rPr>
-        <w:t>Predictive NLP tools make processing and making sense of hostile, racist, or xenophobic posts and comments far more efficient. By evaluating a post right as it goes live (or even right before), these models can anticipate the likely nature and severity of the backlash it might trigger. Pinpointing these contextual triggers mathematically gives activist collectives like Sobremesa en Disidencia an early-warning mechanism to deploy targeted counter-narratives, while giving platforms actionable risk profiles to run proactive moderation.</w:t>
-      </w:r>
-    </w:p>
-    <w:p>
-      <w:pPr>
-        <w:bidi w:val="0"/>
-        <w:spacing w:line="240" w:lineRule="auto"/>
-        <w:jc w:val="both"/>
-        <w:rPr>
-          <w:rFonts w:hint="default" w:ascii="Arial" w:hAnsi="Arial" w:cs="Arial"/>
-          <w:sz w:val="22"/>
-          <w:szCs w:val="22"/>
-        </w:rPr>
-      </w:pPr>
-      <w:r>
-        <w:rPr>
-          <w:rFonts w:hint="default" w:ascii="Arial" w:hAnsi="Arial" w:cs="Arial"/>
-          <w:sz w:val="22"/>
-          <w:szCs w:val="22"/>
-        </w:rPr>
-        <w:t>Aim and Objectives</w:t>
-      </w:r>
-    </w:p>
-    <w:p>
-      <w:pPr>
-        <w:bidi w:val="0"/>
-        <w:spacing w:line="240" w:lineRule="auto"/>
-        <w:jc w:val="both"/>
+      </w:pPr>
+      <w:r>
         <w:rPr>
           <w:rFonts w:hint="default" w:ascii="Arial" w:hAnsi="Arial" w:cs="Arial"/>
           <w:sz w:val="22"/>
           <w:szCs w:val="22"/>
           <w:lang w:val="en-GB"/>
         </w:rPr>
-      </w:pPr>
+        <w:t>Develop a model to predict characteristics related to hostility or heate of the coments of a publication usind the text of the publication it self.</w:t>
+      </w:r>
+    </w:p>
+    <w:p>
+      <w:pPr>
+        <w:bidi w:val="0"/>
+        <w:spacing w:line="240" w:lineRule="auto"/>
+        <w:jc w:val="both"/>
+        <w:rPr>
+          <w:rFonts w:hint="default" w:ascii="Arial" w:hAnsi="Arial" w:cs="Arial"/>
+          <w:sz w:val="22"/>
+          <w:szCs w:val="22"/>
+        </w:rPr>
+      </w:pPr>
+      <w:r>
+        <w:rPr>
+          <w:rFonts w:hint="default" w:ascii="Arial" w:hAnsi="Arial" w:cs="Arial"/>
+          <w:sz w:val="22"/>
+          <w:szCs w:val="22"/>
+        </w:rPr>
+        <w:t>Evaluate the accuracy of pre-trained models in classifying posts and comments.</w:t>
+      </w:r>
+    </w:p>
+    <w:p>
+      <w:pPr>
+        <w:bidi w:val="0"/>
+        <w:spacing w:line="240" w:lineRule="auto"/>
+        <w:jc w:val="both"/>
+        <w:rPr>
+          <w:rFonts w:hint="default" w:ascii="Arial" w:hAnsi="Arial" w:cs="Arial"/>
+          <w:sz w:val="22"/>
+          <w:szCs w:val="22"/>
+        </w:rPr>
+      </w:pPr>
+      <w:r>
+        <w:rPr>
+          <w:rFonts w:hint="default" w:ascii="Arial" w:hAnsi="Arial" w:cs="Arial"/>
+          <w:sz w:val="22"/>
+          <w:szCs w:val="22"/>
+        </w:rPr>
+        <w:t>Identify possible relationships and patterns between the categories of posts and those of their comments.</w:t>
+      </w:r>
+    </w:p>
+    <w:p>
+      <w:pPr>
+        <w:bidi w:val="0"/>
+        <w:spacing w:line="240" w:lineRule="auto"/>
+        <w:jc w:val="both"/>
+        <w:rPr>
+          <w:rFonts w:hint="default" w:ascii="Arial" w:hAnsi="Arial" w:cs="Arial"/>
+          <w:sz w:val="22"/>
+          <w:szCs w:val="22"/>
+        </w:rPr>
+      </w:pPr>
+      <w:r>
+        <w:rPr>
+          <w:rFonts w:hint="default" w:ascii="Arial" w:hAnsi="Arial" w:cs="Arial"/>
+          <w:sz w:val="22"/>
+          <w:szCs w:val="22"/>
+        </w:rPr>
+        <w:t>Determine the optimal combination of models and input variables that maximizes the ability to anticipate</w:t>
+      </w:r>
       <w:r>
         <w:rPr>
           <w:rFonts w:hint="default" w:ascii="Arial" w:hAnsi="Arial" w:cs="Arial"/>
@@ -1060,172 +1092,126 @@
           <w:szCs w:val="22"/>
           <w:lang w:val="en-GB"/>
         </w:rPr>
-        <w:t>Develop a model to predict caracteristics related to hostility or heate of the coments of a publication usind the text of the publication it self.</w:t>
-      </w:r>
-    </w:p>
-    <w:p>
-      <w:pPr>
-        <w:bidi w:val="0"/>
-        <w:spacing w:line="240" w:lineRule="auto"/>
-        <w:jc w:val="both"/>
-        <w:rPr>
-          <w:rFonts w:hint="default" w:ascii="Arial" w:hAnsi="Arial" w:cs="Arial"/>
-          <w:sz w:val="22"/>
-          <w:szCs w:val="22"/>
-        </w:rPr>
-      </w:pPr>
-      <w:r>
-        <w:rPr>
-          <w:rFonts w:hint="default" w:ascii="Arial" w:hAnsi="Arial" w:cs="Arial"/>
-          <w:sz w:val="22"/>
-          <w:szCs w:val="22"/>
-        </w:rPr>
-        <w:t>Evaluate the accuracy of pre-trained models in classifying posts and comments.</w:t>
-      </w:r>
-    </w:p>
-    <w:p>
-      <w:pPr>
-        <w:bidi w:val="0"/>
-        <w:spacing w:line="240" w:lineRule="auto"/>
-        <w:jc w:val="both"/>
-        <w:rPr>
-          <w:rFonts w:hint="default" w:ascii="Arial" w:hAnsi="Arial" w:cs="Arial"/>
-          <w:sz w:val="22"/>
-          <w:szCs w:val="22"/>
-        </w:rPr>
-      </w:pPr>
-      <w:r>
-        <w:rPr>
-          <w:rFonts w:hint="default" w:ascii="Arial" w:hAnsi="Arial" w:cs="Arial"/>
-          <w:sz w:val="22"/>
-          <w:szCs w:val="22"/>
-        </w:rPr>
-        <w:t>Identify possible relationships and patterns between the categories of posts and those of their comments.</w:t>
-      </w:r>
-    </w:p>
-    <w:p>
-      <w:pPr>
-        <w:bidi w:val="0"/>
-        <w:spacing w:line="240" w:lineRule="auto"/>
-        <w:jc w:val="both"/>
-        <w:rPr>
-          <w:rFonts w:hint="default" w:ascii="Arial" w:hAnsi="Arial" w:cs="Arial"/>
-          <w:sz w:val="22"/>
-          <w:szCs w:val="22"/>
-        </w:rPr>
-      </w:pPr>
-      <w:r>
-        <w:rPr>
-          <w:rFonts w:hint="default" w:ascii="Arial" w:hAnsi="Arial" w:cs="Arial"/>
-          <w:sz w:val="22"/>
-          <w:szCs w:val="22"/>
-        </w:rPr>
-        <w:t>Determine the optimal combination of models and input variables that maximizes the ability to anticipate</w:t>
-      </w:r>
-      <w:r>
+        <w:t xml:space="preserve"> characteristics</w:t>
+      </w:r>
+      <w:r>
+        <w:rPr>
+          <w:rFonts w:hint="default" w:ascii="Arial" w:hAnsi="Arial" w:cs="Arial"/>
+          <w:sz w:val="22"/>
+          <w:szCs w:val="22"/>
+        </w:rPr>
+        <w:t xml:space="preserve"> of response comments.</w:t>
+      </w:r>
+    </w:p>
+    <w:p>
+      <w:pPr>
+        <w:numPr>
+          <w:numId w:val="0"/>
+        </w:numPr>
+        <w:bidi w:val="0"/>
+        <w:spacing w:line="240" w:lineRule="auto"/>
+        <w:jc w:val="both"/>
+        <w:rPr>
+          <w:rFonts w:hint="default" w:ascii="Arial" w:hAnsi="Arial" w:cs="Arial"/>
+          <w:sz w:val="22"/>
+          <w:szCs w:val="22"/>
+        </w:rPr>
+      </w:pPr>
+    </w:p>
+    <w:p>
+      <w:pPr>
+        <w:numPr>
+          <w:ilvl w:val="0"/>
+          <w:numId w:val="1"/>
+        </w:numPr>
+        <w:bidi w:val="0"/>
+        <w:spacing w:line="240" w:lineRule="auto"/>
+        <w:jc w:val="both"/>
+        <w:rPr>
+          <w:rFonts w:hint="default" w:ascii="Arial" w:hAnsi="Arial" w:cs="Arial"/>
+          <w:sz w:val="22"/>
+          <w:szCs w:val="22"/>
+        </w:rPr>
+      </w:pPr>
+      <w:r>
+        <w:rPr>
+          <w:rFonts w:hint="default" w:ascii="Arial" w:hAnsi="Arial" w:cs="Arial"/>
+          <w:sz w:val="22"/>
+          <w:szCs w:val="22"/>
+        </w:rPr>
+        <w:t>Scope</w:t>
+      </w:r>
+    </w:p>
+    <w:p>
+      <w:pPr>
+        <w:bidi w:val="0"/>
+        <w:spacing w:line="240" w:lineRule="auto"/>
+        <w:jc w:val="both"/>
+        <w:rPr>
+          <w:rFonts w:hint="default" w:ascii="Arial" w:hAnsi="Arial" w:cs="Arial"/>
+          <w:sz w:val="22"/>
+          <w:szCs w:val="22"/>
+        </w:rPr>
+      </w:pPr>
+      <w:r>
+        <w:rPr>
+          <w:rFonts w:hint="default" w:ascii="Arial" w:hAnsi="Arial" w:cs="Arial"/>
+          <w:sz w:val="22"/>
+          <w:szCs w:val="22"/>
+        </w:rPr>
+        <w:t>Clearly define what will be included and excluded from the project. The proposed work should have sufficient scope for investigation and development across two semesters.</w:t>
+      </w:r>
+    </w:p>
+    <w:p>
+      <w:pPr>
+        <w:bidi w:val="0"/>
+        <w:spacing w:line="240" w:lineRule="auto"/>
+        <w:jc w:val="both"/>
         <w:rPr>
           <w:rFonts w:hint="default" w:ascii="Arial" w:hAnsi="Arial" w:cs="Arial"/>
           <w:sz w:val="22"/>
           <w:szCs w:val="22"/>
           <w:lang w:val="en-GB"/>
         </w:rPr>
-        <w:t xml:space="preserve"> characteristics</w:t>
-      </w:r>
-      <w:r>
-        <w:rPr>
-          <w:rFonts w:hint="default" w:ascii="Arial" w:hAnsi="Arial" w:cs="Arial"/>
-          <w:sz w:val="22"/>
-          <w:szCs w:val="22"/>
-        </w:rPr>
-        <w:t xml:space="preserve"> of response comments.</w:t>
-      </w:r>
-    </w:p>
-    <w:p>
-      <w:pPr>
-        <w:bidi w:val="0"/>
-        <w:spacing w:line="240" w:lineRule="auto"/>
-        <w:jc w:val="both"/>
-        <w:rPr>
-          <w:rFonts w:hint="default" w:ascii="Arial" w:hAnsi="Arial" w:cs="Arial"/>
-          <w:sz w:val="22"/>
-          <w:szCs w:val="22"/>
-        </w:rPr>
-      </w:pPr>
-      <w:r>
-        <w:rPr>
-          <w:rFonts w:hint="default" w:ascii="Arial" w:hAnsi="Arial" w:cs="Arial"/>
-          <w:sz w:val="22"/>
-          <w:szCs w:val="22"/>
-        </w:rPr>
-        <w:t>5. Scope</w:t>
-      </w:r>
-    </w:p>
-    <w:p>
-      <w:pPr>
-        <w:bidi w:val="0"/>
-        <w:spacing w:line="240" w:lineRule="auto"/>
-        <w:jc w:val="both"/>
-        <w:rPr>
-          <w:rFonts w:hint="default" w:ascii="Arial" w:hAnsi="Arial" w:cs="Arial"/>
-          <w:sz w:val="22"/>
-          <w:szCs w:val="22"/>
-        </w:rPr>
-      </w:pPr>
-      <w:r>
-        <w:rPr>
-          <w:rFonts w:hint="default" w:ascii="Arial" w:hAnsi="Arial" w:cs="Arial"/>
-          <w:sz w:val="22"/>
-          <w:szCs w:val="22"/>
-        </w:rPr>
-        <w:t>Clearly define what will be included and excluded from the project. The proposed work should have sufficient scope for investigation and development across two semesters.</w:t>
-      </w:r>
-    </w:p>
-    <w:p>
-      <w:pPr>
-        <w:bidi w:val="0"/>
-        <w:spacing w:line="240" w:lineRule="auto"/>
-        <w:jc w:val="both"/>
+      </w:pPr>
+      <w:r>
         <w:rPr>
           <w:rFonts w:hint="default" w:ascii="Arial" w:hAnsi="Arial" w:cs="Arial"/>
           <w:sz w:val="22"/>
           <w:szCs w:val="22"/>
           <w:lang w:val="en-GB"/>
         </w:rPr>
-      </w:pPr>
-      <w:r>
+        <w:t xml:space="preserve">The project scope will include analisis of text publications and comentaries, but will exclude, because of the higer complexity that this coul imply, the  analisis of images, memes, videos or everythimg that is not text. </w:t>
+      </w:r>
+    </w:p>
+    <w:p>
+      <w:pPr>
+        <w:bidi w:val="0"/>
+        <w:spacing w:line="240" w:lineRule="auto"/>
+        <w:jc w:val="both"/>
         <w:rPr>
           <w:rFonts w:hint="default" w:ascii="Arial" w:hAnsi="Arial" w:cs="Arial"/>
           <w:sz w:val="22"/>
           <w:szCs w:val="22"/>
           <w:lang w:val="en-GB"/>
         </w:rPr>
-        <w:t xml:space="preserve">The project scope will include analisis of text publications and comentaries, but will exclude, because of the higer complexity that this coul imply, the  analisis of images, memes, videos or everythimg that is not text. </w:t>
-      </w:r>
-    </w:p>
-    <w:p>
-      <w:pPr>
-        <w:bidi w:val="0"/>
-        <w:spacing w:line="240" w:lineRule="auto"/>
-        <w:jc w:val="both"/>
+      </w:pPr>
+      <w:r>
         <w:rPr>
           <w:rFonts w:hint="default" w:ascii="Arial" w:hAnsi="Arial" w:cs="Arial"/>
           <w:sz w:val="22"/>
           <w:szCs w:val="22"/>
           <w:lang w:val="en-GB"/>
         </w:rPr>
-      </w:pPr>
-      <w:r>
-        <w:rPr>
-          <w:rFonts w:hint="default" w:ascii="Arial" w:hAnsi="Arial" w:cs="Arial"/>
-          <w:sz w:val="22"/>
-          <w:szCs w:val="22"/>
-          <w:lang w:val="en-GB"/>
-        </w:rPr>
         <w:t>Also there is important to point some limitations of the proyect. Fore example in terms of founding and predicting posible relations betuin a publication and its coments, there is  imposible to separe if these conexions are related wut the messages it self or wuit the fact that certains actors have folowers that will coment heat or certain caracteristics independent of the publication because their share values, perspectives, etc. Other limitation is the inclresingly hier amount of bot ofr fake acounts in internet participating in discutions, so the model could posible interact in the testing wiit bots content generated by IA not by humans.</w:t>
       </w:r>
     </w:p>
     <w:p>
       <w:pPr>
+        <w:numPr>
+          <w:ilvl w:val="0"/>
+          <w:numId w:val="1"/>
+        </w:numPr>
         <w:bidi w:val="0"/>
         <w:spacing w:line="240" w:lineRule="auto"/>
         <w:jc w:val="both"/>
@@ -1246,24 +1232,94 @@
     </w:p>
     <w:p>
       <w:pPr>
-        <w:bidi w:val="0"/>
-        <w:spacing w:line="240" w:lineRule="auto"/>
-        <w:jc w:val="both"/>
-        <w:rPr>
-          <w:rFonts w:hint="default" w:ascii="Arial" w:hAnsi="Arial" w:cs="Arial"/>
-          <w:sz w:val="22"/>
-          <w:szCs w:val="22"/>
-          <w:lang w:val="en-GB"/>
-        </w:rPr>
-      </w:pPr>
-      <w:r>
-        <w:rPr>
-          <w:rFonts w:hint="default" w:ascii="Arial" w:hAnsi="Arial" w:cs="Arial"/>
-          <w:sz w:val="22"/>
-          <w:szCs w:val="22"/>
-          <w:lang w:val="en-GB"/>
-        </w:rPr>
-        <w:t>Probablemente usare transformers, sea de biblioteca de Jupyter o de HuginFaces</w:t>
+        <w:numPr>
+          <w:numId w:val="0"/>
+        </w:numPr>
+        <w:bidi w:val="0"/>
+        <w:spacing w:line="240" w:lineRule="auto"/>
+        <w:jc w:val="both"/>
+        <w:rPr>
+          <w:rFonts w:hint="default" w:ascii="Arial" w:hAnsi="Arial" w:cs="Arial"/>
+          <w:sz w:val="22"/>
+          <w:szCs w:val="22"/>
+        </w:rPr>
+      </w:pPr>
+    </w:p>
+    <w:p>
+      <w:pPr>
+        <w:bidi w:val="0"/>
+        <w:spacing w:line="240" w:lineRule="auto"/>
+        <w:jc w:val="both"/>
+        <w:rPr>
+          <w:rFonts w:hint="default" w:ascii="Arial" w:hAnsi="Arial" w:cs="Arial"/>
+          <w:sz w:val="22"/>
+          <w:szCs w:val="22"/>
+        </w:rPr>
+      </w:pPr>
+    </w:p>
+    <w:p>
+      <w:pPr>
+        <w:bidi w:val="0"/>
+        <w:spacing w:line="240" w:lineRule="auto"/>
+        <w:jc w:val="both"/>
+        <w:rPr>
+          <w:rFonts w:hint="default" w:ascii="Arial" w:hAnsi="Arial" w:cs="Arial"/>
+          <w:sz w:val="22"/>
+          <w:szCs w:val="22"/>
+        </w:rPr>
+      </w:pPr>
+      <w:r>
+        <w:rPr>
+          <w:rFonts w:hint="default" w:ascii="Arial" w:hAnsi="Arial" w:cs="Arial"/>
+          <w:sz w:val="22"/>
+          <w:szCs w:val="22"/>
+          <w:lang w:val="en-US" w:eastAsia="zh-CN"/>
+        </w:rPr>
+        <w:t>At the current stage of the proposal, natural language processing (NLP) methods are expected to serve as the core framework for analyzing both publications and comments. In particular, deep learning models based on transformer architectures will likely be explored, as they are widely used in text classification to capture context and semantic relationships rather than relying solely on isolated keywords. While the exact choice of architecture remains open to preliminary testing and diagnostic evaluation, working with pre-trained open-access models appears to be an appropriate strategy to assess text patterns across both English and Spanish without constructing architectures from scratch.</w:t>
+      </w:r>
+    </w:p>
+    <w:p>
+      <w:pPr>
+        <w:bidi w:val="0"/>
+        <w:spacing w:line="240" w:lineRule="auto"/>
+        <w:jc w:val="both"/>
+        <w:rPr>
+          <w:rFonts w:hint="default" w:ascii="Arial" w:hAnsi="Arial" w:cs="Arial"/>
+          <w:sz w:val="22"/>
+          <w:szCs w:val="22"/>
+        </w:rPr>
+      </w:pPr>
+    </w:p>
+    <w:p>
+      <w:pPr>
+        <w:bidi w:val="0"/>
+        <w:spacing w:line="240" w:lineRule="auto"/>
+        <w:jc w:val="both"/>
+        <w:rPr>
+          <w:rFonts w:hint="default" w:ascii="Arial" w:hAnsi="Arial" w:cs="Arial"/>
+          <w:sz w:val="22"/>
+          <w:szCs w:val="22"/>
+        </w:rPr>
+      </w:pPr>
+      <w:r>
+        <w:rPr>
+          <w:rFonts w:hint="default" w:ascii="Arial" w:hAnsi="Arial" w:cs="Arial"/>
+          <w:sz w:val="22"/>
+          <w:szCs w:val="22"/>
+          <w:lang w:val="en-US" w:eastAsia="zh-CN"/>
+        </w:rPr>
+        <w:t>The technical implementation will be carried out in Python within Jupyter Notebook enviro</w:t>
+      </w:r>
+      <w:bookmarkStart w:id="0" w:name="_GoBack"/>
+      <w:bookmarkEnd w:id="0"/>
+      <w:r>
+        <w:rPr>
+          <w:rFonts w:hint="default" w:ascii="Arial" w:hAnsi="Arial" w:cs="Arial"/>
+          <w:sz w:val="22"/>
+          <w:szCs w:val="22"/>
+          <w:lang w:val="en-US" w:eastAsia="zh-CN"/>
+        </w:rPr>
+        <w:t>nments, utilizing scientific and machine learning libraries such as Pandas, NumPy, Scikit-learn, and PyTorch for data preprocessing, pipeline structuring, and baseline evaluation. Specifically, the Hugging Face transformers ecosystem is planned as the primary interface to ingest, test, and benchmark pre-trained models, as well as to extract token-level attributions and contextual embeddings. This computational setup provides the standard, modular framework required to handle data manipulation, track baseline performance across the selected benchmark datasets, and systematically evaluate the feasibility of predicting downstream comment hostility metrics.</w:t>
       </w:r>
     </w:p>
     <w:p>
@@ -3761,17 +3817,7 @@
                 <w:sz w:val="22"/>
                 <w:szCs w:val="22"/>
               </w:rPr>
-              <w:t>Tabular social media dataset designed for binary text classification</w:t>
-            </w:r>
-            <w:bookmarkStart w:id="0" w:name="_GoBack"/>
-            <w:bookmarkEnd w:id="0"/>
-            <w:r>
-              <w:rPr>
-                <w:rFonts w:hint="default" w:ascii="Arial" w:hAnsi="Arial" w:cs="Arial"/>
-                <w:sz w:val="22"/>
-                <w:szCs w:val="22"/>
-              </w:rPr>
-              <w:t xml:space="preserve"> (text_content and is_racist label).</w:t>
+              <w:t>Tabular social media dataset designed for binary text classification (text_content and is_racist label).</w:t>
             </w:r>
           </w:p>
         </w:tc>
@@ -4341,7 +4387,7 @@
       <w:pPr>
         <w:numPr>
           <w:ilvl w:val="0"/>
-          <w:numId w:val="1"/>
+          <w:numId w:val="2"/>
         </w:numPr>
         <w:bidi w:val="0"/>
         <w:spacing w:line="240" w:lineRule="auto"/>
@@ -4384,6 +4430,7 @@
     <w:p>
       <w:pPr>
         <w:numPr>
+          <w:ilvl w:val="0"/>
           <w:numId w:val="0"/>
         </w:numPr>
         <w:bidi w:val="0"/>
@@ -4398,6 +4445,7 @@
     </w:p>
     <w:tbl>
       <w:tblPr>
+        <w:tblStyle w:val="9"/>
         <w:tblW w:w="0" w:type="auto"/>
         <w:tblCellSpacing w:w="15" w:type="dxa"/>
         <w:tblInd w:w="10" w:type="dxa"/>
@@ -4409,7 +4457,7 @@
           <w:insideH w:val="none" w:color="auto" w:sz="0" w:space="0"/>
           <w:insideV w:val="none" w:color="auto" w:sz="0" w:space="0"/>
         </w:tblBorders>
-        <w:shd w:val="clear"/>
+        <w:shd w:val="clear" w:color="auto" w:fill="auto"/>
         <w:tblLayout w:type="autofit"/>
         <w:tblCellMar>
           <w:top w:w="0" w:type="dxa"/>
@@ -4433,7 +4481,7 @@
             <w:insideH w:val="none" w:color="auto" w:sz="0" w:space="0"/>
             <w:insideV w:val="none" w:color="auto" w:sz="0" w:space="0"/>
           </w:tblBorders>
-          <w:shd w:val="clear"/>
+          <w:shd w:val="clear" w:color="auto" w:fill="auto"/>
           <w:tblCellMar>
             <w:top w:w="0" w:type="dxa"/>
             <w:left w:w="0" w:type="dxa"/>
@@ -4454,7 +4502,7 @@
               <w:bottom w:val="single" w:color="C4C7C5" w:sz="4" w:space="0"/>
               <w:right w:val="single" w:color="C4C7C5" w:sz="4" w:space="0"/>
             </w:tcBorders>
-            <w:shd w:val="clear"/>
+            <w:shd w:val="clear" w:color="auto" w:fill="auto"/>
             <w:tcMar>
               <w:top w:w="120" w:type="dxa"/>
               <w:left w:w="180" w:type="dxa"/>
@@ -4466,6 +4514,7 @@
           <w:p>
             <w:pPr>
               <w:numPr>
+                <w:ilvl w:val="0"/>
                 <w:numId w:val="0"/>
               </w:numPr>
               <w:bidi w:val="0"/>
@@ -4497,7 +4546,7 @@
               <w:bottom w:val="single" w:color="C4C7C5" w:sz="4" w:space="0"/>
               <w:right w:val="single" w:color="C4C7C5" w:sz="4" w:space="0"/>
             </w:tcBorders>
-            <w:shd w:val="clear"/>
+            <w:shd w:val="clear" w:color="auto" w:fill="auto"/>
             <w:tcMar>
               <w:top w:w="120" w:type="dxa"/>
               <w:left w:w="180" w:type="dxa"/>
@@ -4509,6 +4558,7 @@
           <w:p>
             <w:pPr>
               <w:numPr>
+                <w:ilvl w:val="0"/>
                 <w:numId w:val="0"/>
               </w:numPr>
               <w:bidi w:val="0"/>
@@ -4540,7 +4590,7 @@
               <w:bottom w:val="single" w:color="C4C7C5" w:sz="4" w:space="0"/>
               <w:right w:val="single" w:color="C4C7C5" w:sz="4" w:space="0"/>
             </w:tcBorders>
-            <w:shd w:val="clear"/>
+            <w:shd w:val="clear" w:color="auto" w:fill="auto"/>
             <w:tcMar>
               <w:top w:w="120" w:type="dxa"/>
               <w:left w:w="180" w:type="dxa"/>
@@ -4552,6 +4602,7 @@
           <w:p>
             <w:pPr>
               <w:numPr>
+                <w:ilvl w:val="0"/>
                 <w:numId w:val="0"/>
               </w:numPr>
               <w:bidi w:val="0"/>
@@ -4585,7 +4636,7 @@
             <w:insideH w:val="none" w:color="auto" w:sz="0" w:space="0"/>
             <w:insideV w:val="none" w:color="auto" w:sz="0" w:space="0"/>
           </w:tblBorders>
-          <w:shd w:val="clear"/>
+          <w:shd w:val="clear" w:color="auto" w:fill="auto"/>
           <w:tblCellMar>
             <w:top w:w="0" w:type="dxa"/>
             <w:left w:w="0" w:type="dxa"/>
@@ -4605,7 +4656,7 @@
               <w:bottom w:val="single" w:color="C4C7C5" w:sz="4" w:space="0"/>
               <w:right w:val="single" w:color="C4C7C5" w:sz="4" w:space="0"/>
             </w:tcBorders>
-            <w:shd w:val="clear"/>
+            <w:shd w:val="clear" w:color="auto" w:fill="auto"/>
             <w:tcMar>
               <w:top w:w="120" w:type="dxa"/>
               <w:left w:w="180" w:type="dxa"/>
@@ -4617,6 +4668,7 @@
           <w:p>
             <w:pPr>
               <w:numPr>
+                <w:ilvl w:val="0"/>
                 <w:numId w:val="0"/>
               </w:numPr>
               <w:bidi w:val="0"/>
@@ -4648,7 +4700,7 @@
               <w:bottom w:val="single" w:color="C4C7C5" w:sz="4" w:space="0"/>
               <w:right w:val="single" w:color="C4C7C5" w:sz="4" w:space="0"/>
             </w:tcBorders>
-            <w:shd w:val="clear"/>
+            <w:shd w:val="clear" w:color="auto" w:fill="auto"/>
             <w:tcMar>
               <w:top w:w="120" w:type="dxa"/>
               <w:left w:w="180" w:type="dxa"/>
@@ -4660,6 +4712,7 @@
           <w:p>
             <w:pPr>
               <w:numPr>
+                <w:ilvl w:val="0"/>
                 <w:numId w:val="0"/>
               </w:numPr>
               <w:bidi w:val="0"/>
@@ -4691,7 +4744,7 @@
               <w:bottom w:val="single" w:color="C4C7C5" w:sz="4" w:space="0"/>
               <w:right w:val="single" w:color="C4C7C5" w:sz="4" w:space="0"/>
             </w:tcBorders>
-            <w:shd w:val="clear"/>
+            <w:shd w:val="clear" w:color="auto" w:fill="auto"/>
             <w:tcMar>
               <w:top w:w="120" w:type="dxa"/>
               <w:left w:w="180" w:type="dxa"/>
@@ -4703,6 +4756,7 @@
           <w:p>
             <w:pPr>
               <w:numPr>
+                <w:ilvl w:val="0"/>
                 <w:numId w:val="0"/>
               </w:numPr>
               <w:bidi w:val="0"/>
@@ -4727,6 +4781,7 @@
           <w:p>
             <w:pPr>
               <w:numPr>
+                <w:ilvl w:val="0"/>
                 <w:numId w:val="0"/>
               </w:numPr>
               <w:bidi w:val="0"/>
@@ -4751,6 +4806,7 @@
           <w:p>
             <w:pPr>
               <w:numPr>
+                <w:ilvl w:val="0"/>
                 <w:numId w:val="0"/>
               </w:numPr>
               <w:bidi w:val="0"/>
@@ -4784,7 +4840,7 @@
             <w:insideH w:val="none" w:color="auto" w:sz="0" w:space="0"/>
             <w:insideV w:val="none" w:color="auto" w:sz="0" w:space="0"/>
           </w:tblBorders>
-          <w:shd w:val="clear"/>
+          <w:shd w:val="clear" w:color="auto" w:fill="auto"/>
           <w:tblCellMar>
             <w:top w:w="0" w:type="dxa"/>
             <w:left w:w="0" w:type="dxa"/>
@@ -4804,7 +4860,7 @@
               <w:bottom w:val="single" w:color="C4C7C5" w:sz="4" w:space="0"/>
               <w:right w:val="single" w:color="C4C7C5" w:sz="4" w:space="0"/>
             </w:tcBorders>
-            <w:shd w:val="clear"/>
+            <w:shd w:val="clear" w:color="auto" w:fill="auto"/>
             <w:tcMar>
               <w:top w:w="120" w:type="dxa"/>
               <w:left w:w="180" w:type="dxa"/>
@@ -4816,6 +4872,7 @@
           <w:p>
             <w:pPr>
               <w:numPr>
+                <w:ilvl w:val="0"/>
                 <w:numId w:val="0"/>
               </w:numPr>
               <w:bidi w:val="0"/>
@@ -4847,7 +4904,7 @@
               <w:bottom w:val="single" w:color="C4C7C5" w:sz="4" w:space="0"/>
               <w:right w:val="single" w:color="C4C7C5" w:sz="4" w:space="0"/>
             </w:tcBorders>
-            <w:shd w:val="clear"/>
+            <w:shd w:val="clear" w:color="auto" w:fill="auto"/>
             <w:tcMar>
               <w:top w:w="120" w:type="dxa"/>
               <w:left w:w="180" w:type="dxa"/>
@@ -4859,6 +4916,7 @@
           <w:p>
             <w:pPr>
               <w:numPr>
+                <w:ilvl w:val="0"/>
                 <w:numId w:val="0"/>
               </w:numPr>
               <w:bidi w:val="0"/>
@@ -4890,7 +4948,7 @@
               <w:bottom w:val="single" w:color="C4C7C5" w:sz="4" w:space="0"/>
               <w:right w:val="single" w:color="C4C7C5" w:sz="4" w:space="0"/>
             </w:tcBorders>
-            <w:shd w:val="clear"/>
+            <w:shd w:val="clear" w:color="auto" w:fill="auto"/>
             <w:tcMar>
               <w:top w:w="120" w:type="dxa"/>
               <w:left w:w="180" w:type="dxa"/>
@@ -4902,6 +4960,7 @@
           <w:p>
             <w:pPr>
               <w:numPr>
+                <w:ilvl w:val="0"/>
                 <w:numId w:val="0"/>
               </w:numPr>
               <w:bidi w:val="0"/>
@@ -4926,6 +4985,7 @@
           <w:p>
             <w:pPr>
               <w:numPr>
+                <w:ilvl w:val="0"/>
                 <w:numId w:val="0"/>
               </w:numPr>
               <w:bidi w:val="0"/>
@@ -4950,6 +5010,7 @@
           <w:p>
             <w:pPr>
               <w:numPr>
+                <w:ilvl w:val="0"/>
                 <w:numId w:val="0"/>
               </w:numPr>
               <w:bidi w:val="0"/>
@@ -4983,6 +5044,7 @@
             <w:insideH w:val="none" w:color="auto" w:sz="0" w:space="0"/>
             <w:insideV w:val="none" w:color="auto" w:sz="0" w:space="0"/>
           </w:tblBorders>
+          <w:shd w:val="clear" w:color="auto" w:fill="auto"/>
           <w:tblCellMar>
             <w:top w:w="0" w:type="dxa"/>
             <w:left w:w="0" w:type="dxa"/>
@@ -5002,7 +5064,7 @@
               <w:bottom w:val="single" w:color="C4C7C5" w:sz="4" w:space="0"/>
               <w:right w:val="single" w:color="C4C7C5" w:sz="4" w:space="0"/>
             </w:tcBorders>
-            <w:shd w:val="clear"/>
+            <w:shd w:val="clear" w:color="auto" w:fill="auto"/>
             <w:tcMar>
               <w:top w:w="120" w:type="dxa"/>
               <w:left w:w="180" w:type="dxa"/>
@@ -5014,6 +5076,7 @@
           <w:p>
             <w:pPr>
               <w:numPr>
+                <w:ilvl w:val="0"/>
                 <w:numId w:val="0"/>
               </w:numPr>
               <w:bidi w:val="0"/>
@@ -5045,7 +5108,7 @@
               <w:bottom w:val="single" w:color="C4C7C5" w:sz="4" w:space="0"/>
               <w:right w:val="single" w:color="C4C7C5" w:sz="4" w:space="0"/>
             </w:tcBorders>
-            <w:shd w:val="clear"/>
+            <w:shd w:val="clear" w:color="auto" w:fill="auto"/>
             <w:tcMar>
               <w:top w:w="120" w:type="dxa"/>
               <w:left w:w="180" w:type="dxa"/>
@@ -5057,6 +5120,7 @@
           <w:p>
             <w:pPr>
               <w:numPr>
+                <w:ilvl w:val="0"/>
                 <w:numId w:val="0"/>
               </w:numPr>
               <w:bidi w:val="0"/>
@@ -5088,7 +5152,7 @@
               <w:bottom w:val="single" w:color="C4C7C5" w:sz="4" w:space="0"/>
               <w:right w:val="single" w:color="C4C7C5" w:sz="4" w:space="0"/>
             </w:tcBorders>
-            <w:shd w:val="clear"/>
+            <w:shd w:val="clear" w:color="auto" w:fill="auto"/>
             <w:tcMar>
               <w:top w:w="120" w:type="dxa"/>
               <w:left w:w="180" w:type="dxa"/>
@@ -5100,6 +5164,7 @@
           <w:p>
             <w:pPr>
               <w:numPr>
+                <w:ilvl w:val="0"/>
                 <w:numId w:val="0"/>
               </w:numPr>
               <w:bidi w:val="0"/>
@@ -5124,6 +5189,7 @@
           <w:p>
             <w:pPr>
               <w:numPr>
+                <w:ilvl w:val="0"/>
                 <w:numId w:val="0"/>
               </w:numPr>
               <w:bidi w:val="0"/>
@@ -5148,6 +5214,7 @@
           <w:p>
             <w:pPr>
               <w:numPr>
+                <w:ilvl w:val="0"/>
                 <w:numId w:val="0"/>
               </w:numPr>
               <w:bidi w:val="0"/>
@@ -5181,7 +5248,7 @@
             <w:insideH w:val="none" w:color="auto" w:sz="0" w:space="0"/>
             <w:insideV w:val="none" w:color="auto" w:sz="0" w:space="0"/>
           </w:tblBorders>
-          <w:shd w:val="clear"/>
+          <w:shd w:val="clear" w:color="auto" w:fill="auto"/>
           <w:tblCellMar>
             <w:top w:w="0" w:type="dxa"/>
             <w:left w:w="0" w:type="dxa"/>
@@ -5201,7 +5268,7 @@
               <w:bottom w:val="single" w:color="C4C7C5" w:sz="4" w:space="0"/>
               <w:right w:val="single" w:color="C4C7C5" w:sz="4" w:space="0"/>
             </w:tcBorders>
-            <w:shd w:val="clear"/>
+            <w:shd w:val="clear" w:color="auto" w:fill="auto"/>
             <w:tcMar>
               <w:top w:w="120" w:type="dxa"/>
               <w:left w:w="180" w:type="dxa"/>
@@ -5213,6 +5280,7 @@
           <w:p>
             <w:pPr>
               <w:numPr>
+                <w:ilvl w:val="0"/>
                 <w:numId w:val="0"/>
               </w:numPr>
               <w:bidi w:val="0"/>
@@ -5244,7 +5312,7 @@
               <w:bottom w:val="single" w:color="C4C7C5" w:sz="4" w:space="0"/>
               <w:right w:val="single" w:color="C4C7C5" w:sz="4" w:space="0"/>
             </w:tcBorders>
-            <w:shd w:val="clear"/>
+            <w:shd w:val="clear" w:color="auto" w:fill="auto"/>
             <w:tcMar>
               <w:top w:w="120" w:type="dxa"/>
               <w:left w:w="180" w:type="dxa"/>
@@ -5256,6 +5324,7 @@
           <w:p>
             <w:pPr>
               <w:numPr>
+                <w:ilvl w:val="0"/>
                 <w:numId w:val="0"/>
               </w:numPr>
               <w:bidi w:val="0"/>
@@ -5287,7 +5356,7 @@
               <w:bottom w:val="single" w:color="C4C7C5" w:sz="4" w:space="0"/>
               <w:right w:val="single" w:color="C4C7C5" w:sz="4" w:space="0"/>
             </w:tcBorders>
-            <w:shd w:val="clear"/>
+            <w:shd w:val="clear" w:color="auto" w:fill="auto"/>
             <w:tcMar>
               <w:top w:w="120" w:type="dxa"/>
               <w:left w:w="180" w:type="dxa"/>
@@ -5299,6 +5368,7 @@
           <w:p>
             <w:pPr>
               <w:numPr>
+                <w:ilvl w:val="0"/>
                 <w:numId w:val="0"/>
               </w:numPr>
               <w:bidi w:val="0"/>
@@ -5323,6 +5393,7 @@
           <w:p>
             <w:pPr>
               <w:numPr>
+                <w:ilvl w:val="0"/>
                 <w:numId w:val="0"/>
               </w:numPr>
               <w:bidi w:val="0"/>
@@ -5347,6 +5418,7 @@
           <w:p>
             <w:pPr>
               <w:numPr>
+                <w:ilvl w:val="0"/>
                 <w:numId w:val="0"/>
               </w:numPr>
               <w:bidi w:val="0"/>
@@ -5380,7 +5452,7 @@
             <w:insideH w:val="none" w:color="auto" w:sz="0" w:space="0"/>
             <w:insideV w:val="none" w:color="auto" w:sz="0" w:space="0"/>
           </w:tblBorders>
-          <w:shd w:val="clear"/>
+          <w:shd w:val="clear" w:color="auto" w:fill="auto"/>
           <w:tblCellMar>
             <w:top w:w="0" w:type="dxa"/>
             <w:left w:w="0" w:type="dxa"/>
@@ -5400,7 +5472,7 @@
               <w:bottom w:val="single" w:color="C4C7C5" w:sz="4" w:space="0"/>
               <w:right w:val="single" w:color="C4C7C5" w:sz="4" w:space="0"/>
             </w:tcBorders>
-            <w:shd w:val="clear"/>
+            <w:shd w:val="clear" w:color="auto" w:fill="auto"/>
             <w:tcMar>
               <w:top w:w="120" w:type="dxa"/>
               <w:left w:w="180" w:type="dxa"/>
@@ -5412,6 +5484,7 @@
           <w:p>
             <w:pPr>
               <w:numPr>
+                <w:ilvl w:val="0"/>
                 <w:numId w:val="0"/>
               </w:numPr>
               <w:bidi w:val="0"/>
@@ -5443,7 +5516,7 @@
               <w:bottom w:val="single" w:color="C4C7C5" w:sz="4" w:space="0"/>
               <w:right w:val="single" w:color="C4C7C5" w:sz="4" w:space="0"/>
             </w:tcBorders>
-            <w:shd w:val="clear"/>
+            <w:shd w:val="clear" w:color="auto" w:fill="auto"/>
             <w:tcMar>
               <w:top w:w="120" w:type="dxa"/>
               <w:left w:w="180" w:type="dxa"/>
@@ -5455,6 +5528,7 @@
           <w:p>
             <w:pPr>
               <w:numPr>
+                <w:ilvl w:val="0"/>
                 <w:numId w:val="0"/>
               </w:numPr>
               <w:bidi w:val="0"/>
@@ -5486,7 +5560,7 @@
               <w:bottom w:val="single" w:color="C4C7C5" w:sz="4" w:space="0"/>
               <w:right w:val="single" w:color="C4C7C5" w:sz="4" w:space="0"/>
             </w:tcBorders>
-            <w:shd w:val="clear"/>
+            <w:shd w:val="clear" w:color="auto" w:fill="auto"/>
             <w:tcMar>
               <w:top w:w="120" w:type="dxa"/>
               <w:left w:w="180" w:type="dxa"/>
@@ -5498,6 +5572,7 @@
           <w:p>
             <w:pPr>
               <w:numPr>
+                <w:ilvl w:val="0"/>
                 <w:numId w:val="0"/>
               </w:numPr>
               <w:bidi w:val="0"/>
@@ -5522,6 +5597,7 @@
           <w:p>
             <w:pPr>
               <w:numPr>
+                <w:ilvl w:val="0"/>
                 <w:numId w:val="0"/>
               </w:numPr>
               <w:bidi w:val="0"/>
@@ -5546,6 +5622,7 @@
           <w:p>
             <w:pPr>
               <w:numPr>
+                <w:ilvl w:val="0"/>
                 <w:numId w:val="0"/>
               </w:numPr>
               <w:bidi w:val="0"/>
@@ -5561,6 +5638,7 @@
           <w:p>
             <w:pPr>
               <w:numPr>
+                <w:ilvl w:val="0"/>
                 <w:numId w:val="0"/>
               </w:numPr>
               <w:bidi w:val="0"/>
@@ -5585,6 +5663,7 @@
           <w:p>
             <w:pPr>
               <w:numPr>
+                <w:ilvl w:val="0"/>
                 <w:numId w:val="0"/>
               </w:numPr>
               <w:bidi w:val="0"/>
@@ -5609,7 +5688,7 @@
             <w:insideH w:val="none" w:color="auto" w:sz="0" w:space="0"/>
             <w:insideV w:val="none" w:color="auto" w:sz="0" w:space="0"/>
           </w:tblBorders>
-          <w:shd w:val="clear"/>
+          <w:shd w:val="clear" w:color="auto" w:fill="auto"/>
           <w:tblCellMar>
             <w:top w:w="0" w:type="dxa"/>
             <w:left w:w="0" w:type="dxa"/>
@@ -5629,7 +5708,7 @@
               <w:bottom w:val="single" w:color="C4C7C5" w:sz="4" w:space="0"/>
               <w:right w:val="single" w:color="C4C7C5" w:sz="4" w:space="0"/>
             </w:tcBorders>
-            <w:shd w:val="clear"/>
+            <w:shd w:val="clear" w:color="auto" w:fill="auto"/>
             <w:tcMar>
               <w:top w:w="120" w:type="dxa"/>
               <w:left w:w="180" w:type="dxa"/>
@@ -5641,6 +5720,7 @@
           <w:p>
             <w:pPr>
               <w:numPr>
+                <w:ilvl w:val="0"/>
                 <w:numId w:val="0"/>
               </w:numPr>
               <w:bidi w:val="0"/>
@@ -5672,7 +5752,7 @@
               <w:bottom w:val="single" w:color="C4C7C5" w:sz="4" w:space="0"/>
               <w:right w:val="single" w:color="C4C7C5" w:sz="4" w:space="0"/>
             </w:tcBorders>
-            <w:shd w:val="clear"/>
+            <w:shd w:val="clear" w:color="auto" w:fill="auto"/>
             <w:tcMar>
               <w:top w:w="120" w:type="dxa"/>
               <w:left w:w="180" w:type="dxa"/>
@@ -5684,6 +5764,7 @@
           <w:p>
             <w:pPr>
               <w:numPr>
+                <w:ilvl w:val="0"/>
                 <w:numId w:val="0"/>
               </w:numPr>
               <w:bidi w:val="0"/>
@@ -5715,7 +5796,7 @@
               <w:bottom w:val="single" w:color="C4C7C5" w:sz="4" w:space="0"/>
               <w:right w:val="single" w:color="C4C7C5" w:sz="4" w:space="0"/>
             </w:tcBorders>
-            <w:shd w:val="clear"/>
+            <w:shd w:val="clear" w:color="auto" w:fill="auto"/>
             <w:tcMar>
               <w:top w:w="120" w:type="dxa"/>
               <w:left w:w="180" w:type="dxa"/>
@@ -5727,6 +5808,7 @@
           <w:p>
             <w:pPr>
               <w:numPr>
+                <w:ilvl w:val="0"/>
                 <w:numId w:val="0"/>
               </w:numPr>
               <w:bidi w:val="0"/>
@@ -5751,6 +5833,7 @@
           <w:p>
             <w:pPr>
               <w:numPr>
+                <w:ilvl w:val="0"/>
                 <w:numId w:val="0"/>
               </w:numPr>
               <w:bidi w:val="0"/>
@@ -5766,6 +5849,7 @@
           <w:p>
             <w:pPr>
               <w:numPr>
+                <w:ilvl w:val="0"/>
                 <w:numId w:val="0"/>
               </w:numPr>
               <w:bidi w:val="0"/>
@@ -5790,6 +5874,7 @@
           <w:p>
             <w:pPr>
               <w:numPr>
+                <w:ilvl w:val="0"/>
                 <w:numId w:val="0"/>
               </w:numPr>
               <w:bidi w:val="0"/>
@@ -5805,6 +5890,7 @@
           <w:p>
             <w:pPr>
               <w:numPr>
+                <w:ilvl w:val="0"/>
                 <w:numId w:val="0"/>
               </w:numPr>
               <w:bidi w:val="0"/>
@@ -5832,6 +5918,7 @@
     <w:p>
       <w:pPr>
         <w:numPr>
+          <w:ilvl w:val="0"/>
           <w:numId w:val="0"/>
         </w:numPr>
         <w:bidi w:val="0"/>
@@ -5848,7 +5935,7 @@
       <w:pPr>
         <w:numPr>
           <w:ilvl w:val="0"/>
-          <w:numId w:val="1"/>
+          <w:numId w:val="2"/>
         </w:numPr>
         <w:bidi w:val="0"/>
         <w:spacing w:line="240" w:lineRule="auto"/>
@@ -5920,6 +6007,7 @@
     <w:p>
       <w:pPr>
         <w:numPr>
+          <w:ilvl w:val="0"/>
           <w:numId w:val="0"/>
         </w:numPr>
         <w:bidi w:val="0"/>
@@ -5936,7 +6024,7 @@
       <w:pPr>
         <w:numPr>
           <w:ilvl w:val="0"/>
-          <w:numId w:val="1"/>
+          <w:numId w:val="2"/>
         </w:numPr>
         <w:bidi w:val="0"/>
         <w:spacing w:line="240" w:lineRule="auto"/>
@@ -6578,6 +6666,7 @@
             <w:insideH w:val="none" w:color="auto" w:sz="0" w:space="0"/>
             <w:insideV w:val="none" w:color="auto" w:sz="0" w:space="0"/>
           </w:tblBorders>
+          <w:shd w:val="clear" w:color="auto" w:fill="auto"/>
           <w:tblCellMar>
             <w:top w:w="15" w:type="dxa"/>
             <w:left w:w="15" w:type="dxa"/>
@@ -7060,6 +7149,7 @@
             <w:insideH w:val="none" w:color="auto" w:sz="0" w:space="0"/>
             <w:insideV w:val="none" w:color="auto" w:sz="0" w:space="0"/>
           </w:tblBorders>
+          <w:shd w:val="clear" w:color="auto" w:fill="auto"/>
           <w:tblCellMar>
             <w:top w:w="15" w:type="dxa"/>
             <w:left w:w="15" w:type="dxa"/>
@@ -7323,6 +7413,7 @@
             <w:insideH w:val="none" w:color="auto" w:sz="0" w:space="0"/>
             <w:insideV w:val="none" w:color="auto" w:sz="0" w:space="0"/>
           </w:tblBorders>
+          <w:shd w:val="clear" w:color="auto" w:fill="auto"/>
           <w:tblCellMar>
             <w:top w:w="15" w:type="dxa"/>
             <w:left w:w="15" w:type="dxa"/>
@@ -7755,6 +7846,18 @@
 <file path=word/numbering.xml><?xml version="1.0" encoding="utf-8"?>
 <w:numbering xmlns:wpc="http://schemas.microsoft.com/office/word/2010/wordprocessingCanvas" xmlns:mc="http://schemas.openxmlformats.org/markup-compatibility/2006" xmlns:o="urn:schemas-microsoft-com:office:office" xmlns:r="http://schemas.openxmlformats.org/officeDocument/2006/relationships" xmlns:m="http://schemas.openxmlformats.org/officeDocument/2006/math" xmlns:v="urn:schemas-microsoft-com:vml" xmlns:wp14="http://schemas.microsoft.com/office/word/2010/wordprocessingDrawing" xmlns:wp="http://schemas.openxmlformats.org/drawingml/2006/wordprocessingDrawing" xmlns:w10="urn:schemas-microsoft-com:office:word" xmlns:w="http://schemas.openxmlformats.org/wordprocessingml/2006/main" xmlns:w14="http://schemas.microsoft.com/office/word/2010/wordml" xmlns:wpg="http://schemas.microsoft.com/office/word/2010/wordprocessingGroup" xmlns:wpi="http://schemas.microsoft.com/office/word/2010/wordprocessingInk" xmlns:wne="http://schemas.microsoft.com/office/word/2006/wordml" xmlns:wps="http://schemas.microsoft.com/office/word/2010/wordprocessingShape" xmlns:wpsCustomData="http://www.wps.cn/officeDocument/2013/wpsCustomData" mc:Ignorable="w14 wp14">
   <w:abstractNum w:abstractNumId="0">
+    <w:nsid w:val="FDADD264"/>
+    <w:multiLevelType w:val="singleLevel"/>
+    <w:tmpl w:val="FDADD264"/>
+    <w:lvl w:ilvl="0" w:tentative="0">
+      <w:start w:val="5"/>
+      <w:numFmt w:val="decimal"/>
+      <w:suff w:val="space"/>
+      <w:lvlText w:val="%1."/>
+      <w:lvlJc w:val="left"/>
+    </w:lvl>
+  </w:abstractNum>
+  <w:abstractNum w:abstractNumId="1">
     <w:nsid w:val="229742CA"/>
     <w:multiLevelType w:val="singleLevel"/>
     <w:tmpl w:val="229742CA"/>
@@ -7768,6 +7871,9 @@
   </w:abstractNum>
   <w:num w:numId="1">
     <w:abstractNumId w:val="0"/>
+  </w:num>
+  <w:num w:numId="2">
+    <w:abstractNumId w:val="1"/>
   </w:num>
 </w:numbering>
 </file>

</xml_diff>

<commit_message>
AI Explanation and declaration
</commit_message>
<xml_diff>
--- a/Draft.CA1-Strategic Thinking- 20%.docx
+++ b/Draft.CA1-Strategic Thinking- 20%.docx
@@ -140,7 +140,6 @@
             <w:insideH w:val="none" w:color="auto" w:sz="0" w:space="0"/>
             <w:insideV w:val="none" w:color="auto" w:sz="0" w:space="0"/>
           </w:tblBorders>
-          <w:shd w:val="clear" w:color="auto" w:fill="auto"/>
           <w:tblCellMar>
             <w:top w:w="15" w:type="dxa"/>
             <w:left w:w="15" w:type="dxa"/>
@@ -340,7 +339,6 @@
             <w:insideH w:val="none" w:color="auto" w:sz="0" w:space="0"/>
             <w:insideV w:val="none" w:color="auto" w:sz="0" w:space="0"/>
           </w:tblBorders>
-          <w:shd w:val="clear" w:color="auto" w:fill="auto"/>
           <w:tblCellMar>
             <w:top w:w="15" w:type="dxa"/>
             <w:left w:w="15" w:type="dxa"/>
@@ -426,6 +424,105 @@
                 <w:szCs w:val="22"/>
               </w:rPr>
               <w:t>Strategic Thinking </w:t>
+            </w:r>
+          </w:p>
+        </w:tc>
+      </w:tr>
+      <w:tr>
+        <w:tblPrEx>
+          <w:tblBorders>
+            <w:top w:val="none" w:color="auto" w:sz="0" w:space="0"/>
+            <w:left w:val="none" w:color="auto" w:sz="0" w:space="0"/>
+            <w:bottom w:val="none" w:color="auto" w:sz="0" w:space="0"/>
+            <w:right w:val="none" w:color="auto" w:sz="0" w:space="0"/>
+            <w:insideH w:val="none" w:color="auto" w:sz="0" w:space="0"/>
+            <w:insideV w:val="none" w:color="auto" w:sz="0" w:space="0"/>
+          </w:tblBorders>
+          <w:tblCellMar>
+            <w:top w:w="15" w:type="dxa"/>
+            <w:left w:w="15" w:type="dxa"/>
+            <w:bottom w:w="15" w:type="dxa"/>
+            <w:right w:w="15" w:type="dxa"/>
+          </w:tblCellMar>
+        </w:tblPrEx>
+        <w:trPr>
+          <w:trHeight w:val="0" w:hRule="atLeast"/>
+        </w:trPr>
+        <w:tc>
+          <w:tcPr>
+            <w:tcW w:w="0" w:type="auto"/>
+            <w:tcBorders>
+              <w:top w:val="single" w:color="000000" w:sz="4" w:space="0"/>
+              <w:left w:val="single" w:color="000000" w:sz="4" w:space="0"/>
+              <w:bottom w:val="single" w:color="000000" w:sz="4" w:space="0"/>
+              <w:right w:val="single" w:color="000000" w:sz="4" w:space="0"/>
+            </w:tcBorders>
+            <w:shd w:val="clear" w:color="auto" w:fill="auto"/>
+            <w:tcMar>
+              <w:top w:w="60" w:type="dxa"/>
+              <w:left w:w="100" w:type="dxa"/>
+              <w:bottom w:w="60" w:type="dxa"/>
+              <w:right w:w="100" w:type="dxa"/>
+            </w:tcMar>
+            <w:vAlign w:val="center"/>
+          </w:tcPr>
+          <w:p>
+            <w:pPr>
+              <w:bidi w:val="0"/>
+              <w:spacing w:line="240" w:lineRule="auto"/>
+              <w:jc w:val="both"/>
+              <w:rPr>
+                <w:rFonts w:hint="default" w:ascii="Arial" w:hAnsi="Arial" w:cs="Arial"/>
+                <w:sz w:val="22"/>
+                <w:szCs w:val="22"/>
+              </w:rPr>
+            </w:pPr>
+            <w:r>
+              <w:rPr>
+                <w:rFonts w:hint="default" w:ascii="Arial" w:hAnsi="Arial" w:cs="Arial"/>
+                <w:sz w:val="22"/>
+                <w:szCs w:val="22"/>
+              </w:rPr>
+              <w:t>Assessment Title</w:t>
+            </w:r>
+          </w:p>
+        </w:tc>
+        <w:tc>
+          <w:tcPr>
+            <w:tcW w:w="6918" w:type="dxa"/>
+            <w:tcBorders>
+              <w:top w:val="single" w:color="000000" w:sz="4" w:space="0"/>
+              <w:left w:val="single" w:color="000000" w:sz="4" w:space="0"/>
+              <w:bottom w:val="single" w:color="000000" w:sz="4" w:space="0"/>
+              <w:right w:val="single" w:color="000000" w:sz="4" w:space="0"/>
+            </w:tcBorders>
+            <w:shd w:val="clear" w:color="auto" w:fill="auto"/>
+            <w:tcMar>
+              <w:top w:w="60" w:type="dxa"/>
+              <w:left w:w="100" w:type="dxa"/>
+              <w:bottom w:w="60" w:type="dxa"/>
+              <w:right w:w="100" w:type="dxa"/>
+            </w:tcMar>
+            <w:vAlign w:val="top"/>
+          </w:tcPr>
+          <w:p>
+            <w:pPr>
+              <w:bidi w:val="0"/>
+              <w:spacing w:line="240" w:lineRule="auto"/>
+              <w:jc w:val="both"/>
+              <w:rPr>
+                <w:rFonts w:hint="default" w:ascii="Arial" w:hAnsi="Arial" w:cs="Arial"/>
+                <w:sz w:val="22"/>
+                <w:szCs w:val="22"/>
+              </w:rPr>
+            </w:pPr>
+            <w:r>
+              <w:rPr>
+                <w:rFonts w:hint="default" w:ascii="Arial" w:hAnsi="Arial" w:cs="Arial"/>
+                <w:sz w:val="22"/>
+                <w:szCs w:val="22"/>
+              </w:rPr>
+              <w:t>CA 1 – Capstone Project Proposal</w:t>
             </w:r>
           </w:p>
         </w:tc>
@@ -486,7 +583,7 @@
                 <w:sz w:val="22"/>
                 <w:szCs w:val="22"/>
               </w:rPr>
-              <w:t>Assessment Title</w:t>
+              <w:t>Lecturer/Supervisor</w:t>
             </w:r>
           </w:p>
         </w:tc>
@@ -525,7 +622,7 @@
                 <w:sz w:val="22"/>
                 <w:szCs w:val="22"/>
               </w:rPr>
-              <w:t>CA 1 – Capstone Project Proposal</w:t>
+              <w:t>Taufique Ahmed</w:t>
             </w:r>
           </w:p>
         </w:tc>
@@ -586,7 +683,7 @@
                 <w:sz w:val="22"/>
                 <w:szCs w:val="22"/>
               </w:rPr>
-              <w:t>Lecturer/Supervisor</w:t>
+              <w:t>Assessment Due Date</w:t>
             </w:r>
           </w:p>
         </w:tc>
@@ -619,14 +716,6 @@
                 <w:szCs w:val="22"/>
               </w:rPr>
             </w:pPr>
-            <w:r>
-              <w:rPr>
-                <w:rFonts w:hint="default" w:ascii="Arial" w:hAnsi="Arial" w:cs="Arial"/>
-                <w:sz w:val="22"/>
-                <w:szCs w:val="22"/>
-              </w:rPr>
-              <w:t>Taufique Ahmed</w:t>
-            </w:r>
           </w:p>
         </w:tc>
       </w:tr>
@@ -686,7 +775,7 @@
                 <w:sz w:val="22"/>
                 <w:szCs w:val="22"/>
               </w:rPr>
-              <w:t>Assessment Due Date</w:t>
+              <w:t>Date of Submission</w:t>
             </w:r>
           </w:p>
         </w:tc>
@@ -722,98 +811,6 @@
           </w:p>
         </w:tc>
       </w:tr>
-      <w:tr>
-        <w:tblPrEx>
-          <w:tblBorders>
-            <w:top w:val="none" w:color="auto" w:sz="0" w:space="0"/>
-            <w:left w:val="none" w:color="auto" w:sz="0" w:space="0"/>
-            <w:bottom w:val="none" w:color="auto" w:sz="0" w:space="0"/>
-            <w:right w:val="none" w:color="auto" w:sz="0" w:space="0"/>
-            <w:insideH w:val="none" w:color="auto" w:sz="0" w:space="0"/>
-            <w:insideV w:val="none" w:color="auto" w:sz="0" w:space="0"/>
-          </w:tblBorders>
-          <w:shd w:val="clear" w:color="auto" w:fill="auto"/>
-          <w:tblCellMar>
-            <w:top w:w="15" w:type="dxa"/>
-            <w:left w:w="15" w:type="dxa"/>
-            <w:bottom w:w="15" w:type="dxa"/>
-            <w:right w:w="15" w:type="dxa"/>
-          </w:tblCellMar>
-        </w:tblPrEx>
-        <w:trPr>
-          <w:trHeight w:val="0" w:hRule="atLeast"/>
-        </w:trPr>
-        <w:tc>
-          <w:tcPr>
-            <w:tcW w:w="0" w:type="auto"/>
-            <w:tcBorders>
-              <w:top w:val="single" w:color="000000" w:sz="4" w:space="0"/>
-              <w:left w:val="single" w:color="000000" w:sz="4" w:space="0"/>
-              <w:bottom w:val="single" w:color="000000" w:sz="4" w:space="0"/>
-              <w:right w:val="single" w:color="000000" w:sz="4" w:space="0"/>
-            </w:tcBorders>
-            <w:shd w:val="clear" w:color="auto" w:fill="auto"/>
-            <w:tcMar>
-              <w:top w:w="60" w:type="dxa"/>
-              <w:left w:w="100" w:type="dxa"/>
-              <w:bottom w:w="60" w:type="dxa"/>
-              <w:right w:w="100" w:type="dxa"/>
-            </w:tcMar>
-            <w:vAlign w:val="center"/>
-          </w:tcPr>
-          <w:p>
-            <w:pPr>
-              <w:bidi w:val="0"/>
-              <w:spacing w:line="240" w:lineRule="auto"/>
-              <w:jc w:val="both"/>
-              <w:rPr>
-                <w:rFonts w:hint="default" w:ascii="Arial" w:hAnsi="Arial" w:cs="Arial"/>
-                <w:sz w:val="22"/>
-                <w:szCs w:val="22"/>
-              </w:rPr>
-            </w:pPr>
-            <w:r>
-              <w:rPr>
-                <w:rFonts w:hint="default" w:ascii="Arial" w:hAnsi="Arial" w:cs="Arial"/>
-                <w:sz w:val="22"/>
-                <w:szCs w:val="22"/>
-              </w:rPr>
-              <w:t>Date of Submission</w:t>
-            </w:r>
-          </w:p>
-        </w:tc>
-        <w:tc>
-          <w:tcPr>
-            <w:tcW w:w="6918" w:type="dxa"/>
-            <w:tcBorders>
-              <w:top w:val="single" w:color="000000" w:sz="4" w:space="0"/>
-              <w:left w:val="single" w:color="000000" w:sz="4" w:space="0"/>
-              <w:bottom w:val="single" w:color="000000" w:sz="4" w:space="0"/>
-              <w:right w:val="single" w:color="000000" w:sz="4" w:space="0"/>
-            </w:tcBorders>
-            <w:shd w:val="clear" w:color="auto" w:fill="auto"/>
-            <w:tcMar>
-              <w:top w:w="60" w:type="dxa"/>
-              <w:left w:w="100" w:type="dxa"/>
-              <w:bottom w:w="60" w:type="dxa"/>
-              <w:right w:w="100" w:type="dxa"/>
-            </w:tcMar>
-            <w:vAlign w:val="top"/>
-          </w:tcPr>
-          <w:p>
-            <w:pPr>
-              <w:bidi w:val="0"/>
-              <w:spacing w:line="240" w:lineRule="auto"/>
-              <w:jc w:val="both"/>
-              <w:rPr>
-                <w:rFonts w:hint="default" w:ascii="Arial" w:hAnsi="Arial" w:cs="Arial"/>
-                <w:sz w:val="22"/>
-                <w:szCs w:val="22"/>
-              </w:rPr>
-            </w:pPr>
-          </w:p>
-        </w:tc>
-      </w:tr>
     </w:tbl>
     <w:p>
       <w:pPr>
@@ -1106,6 +1103,7 @@
     <w:p>
       <w:pPr>
         <w:numPr>
+          <w:ilvl w:val="0"/>
           <w:numId w:val="0"/>
         </w:numPr>
         <w:bidi w:val="0"/>
@@ -1233,6 +1231,7 @@
     <w:p>
       <w:pPr>
         <w:numPr>
+          <w:ilvl w:val="0"/>
           <w:numId w:val="0"/>
         </w:numPr>
         <w:bidi w:val="0"/>
@@ -1308,18 +1307,7 @@
           <w:szCs w:val="22"/>
           <w:lang w:val="en-US" w:eastAsia="zh-CN"/>
         </w:rPr>
-        <w:t>The technical implementation will be carried out in Python within Jupyter Notebook enviro</w:t>
-      </w:r>
-      <w:bookmarkStart w:id="0" w:name="_GoBack"/>
-      <w:bookmarkEnd w:id="0"/>
-      <w:r>
-        <w:rPr>
-          <w:rFonts w:hint="default" w:ascii="Arial" w:hAnsi="Arial" w:cs="Arial"/>
-          <w:sz w:val="22"/>
-          <w:szCs w:val="22"/>
-          <w:lang w:val="en-US" w:eastAsia="zh-CN"/>
-        </w:rPr>
-        <w:t>nments, utilizing scientific and machine learning libraries such as Pandas, NumPy, Scikit-learn, and PyTorch for data preprocessing, pipeline structuring, and baseline evaluation. Specifically, the Hugging Face transformers ecosystem is planned as the primary interface to ingest, test, and benchmark pre-trained models, as well as to extract token-level attributions and contextual embeddings. This computational setup provides the standard, modular framework required to handle data manipulation, track baseline performance across the selected benchmark datasets, and systematically evaluate the feasibility of predicting downstream comment hostility metrics.</w:t>
+        <w:t>The technical implementation will be carried out in Python within Jupyter Notebook environments, utilizing scientific and machine learning libraries such as Pandas, NumPy, Scikit-learn, and PyTorch for data preprocessing, pipeline structuring, and baseline evaluation. Specifically, the Hugging Face transformers ecosystem is planned as the primary interface to ingest, test, and benchmark pre-trained models, as well as to extract token-level attributions and contextual embeddings. This computational setup provides the standard, modular framework required to handle data manipulation, track baseline performance across the selected benchmark datasets, and systematically evaluate the feasibility of predicting downstream comment hostility metrics.</w:t>
       </w:r>
     </w:p>
     <w:p>
@@ -4050,7 +4038,6 @@
             <w:insideH w:val="none" w:color="auto" w:sz="0" w:space="0"/>
             <w:insideV w:val="none" w:color="auto" w:sz="0" w:space="0"/>
           </w:tblBorders>
-          <w:shd w:val="clear" w:color="auto" w:fill="auto"/>
           <w:tblCellMar>
             <w:top w:w="15" w:type="dxa"/>
             <w:left w:w="15" w:type="dxa"/>
@@ -5452,7 +5439,6 @@
             <w:insideH w:val="none" w:color="auto" w:sz="0" w:space="0"/>
             <w:insideV w:val="none" w:color="auto" w:sz="0" w:space="0"/>
           </w:tblBorders>
-          <w:shd w:val="clear" w:color="auto" w:fill="auto"/>
           <w:tblCellMar>
             <w:top w:w="0" w:type="dxa"/>
             <w:left w:w="0" w:type="dxa"/>
@@ -6450,70 +6436,243 @@
         </w:rPr>
       </w:pPr>
     </w:p>
+    <w:p>
+      <w:pPr>
+        <w:bidi w:val="0"/>
+        <w:spacing w:line="240" w:lineRule="auto"/>
+        <w:jc w:val="both"/>
+        <w:rPr>
+          <w:rFonts w:hint="default" w:ascii="Arial" w:hAnsi="Arial" w:cs="Arial"/>
+          <w:sz w:val="22"/>
+          <w:szCs w:val="22"/>
+          <w:lang w:val="en-US" w:eastAsia="zh-CN"/>
+        </w:rPr>
+      </w:pPr>
+    </w:p>
+    <w:p>
+      <w:pPr>
+        <w:bidi w:val="0"/>
+        <w:spacing w:line="240" w:lineRule="auto"/>
+        <w:jc w:val="both"/>
+        <w:rPr>
+          <w:rFonts w:hint="default" w:ascii="Arial" w:hAnsi="Arial" w:cs="Arial"/>
+          <w:sz w:val="22"/>
+          <w:szCs w:val="22"/>
+          <w:lang w:val="en-US" w:eastAsia="zh-CN"/>
+        </w:rPr>
+      </w:pPr>
+    </w:p>
+    <w:p>
+      <w:pPr>
+        <w:bidi w:val="0"/>
+        <w:spacing w:line="240" w:lineRule="auto"/>
+        <w:jc w:val="both"/>
+        <w:rPr>
+          <w:rFonts w:hint="default" w:ascii="Arial" w:hAnsi="Arial" w:cs="Arial"/>
+          <w:sz w:val="22"/>
+          <w:szCs w:val="22"/>
+          <w:lang w:val="en-US" w:eastAsia="zh-CN"/>
+        </w:rPr>
+      </w:pPr>
+    </w:p>
+    <w:p>
+      <w:pPr>
+        <w:bidi w:val="0"/>
+        <w:spacing w:line="240" w:lineRule="auto"/>
+        <w:jc w:val="both"/>
+        <w:rPr>
+          <w:rFonts w:hint="default" w:ascii="Arial" w:hAnsi="Arial" w:cs="Arial"/>
+          <w:sz w:val="22"/>
+          <w:szCs w:val="22"/>
+          <w:lang w:val="en-US" w:eastAsia="zh-CN"/>
+        </w:rPr>
+      </w:pPr>
+    </w:p>
+    <w:p>
+      <w:pPr>
+        <w:bidi w:val="0"/>
+        <w:spacing w:line="240" w:lineRule="auto"/>
+        <w:jc w:val="both"/>
+        <w:rPr>
+          <w:rFonts w:hint="default" w:ascii="Arial" w:hAnsi="Arial" w:cs="Arial"/>
+          <w:sz w:val="22"/>
+          <w:szCs w:val="22"/>
+          <w:lang w:val="en-US" w:eastAsia="zh-CN"/>
+        </w:rPr>
+      </w:pPr>
+    </w:p>
+    <w:p>
+      <w:pPr>
+        <w:bidi w:val="0"/>
+        <w:spacing w:line="240" w:lineRule="auto"/>
+        <w:jc w:val="both"/>
+        <w:rPr>
+          <w:rFonts w:hint="default" w:ascii="Arial" w:hAnsi="Arial" w:cs="Arial"/>
+          <w:sz w:val="22"/>
+          <w:szCs w:val="22"/>
+          <w:lang w:val="en-US" w:eastAsia="zh-CN"/>
+        </w:rPr>
+      </w:pPr>
+    </w:p>
+    <w:p>
+      <w:pPr>
+        <w:bidi w:val="0"/>
+        <w:spacing w:line="240" w:lineRule="auto"/>
+        <w:jc w:val="both"/>
+        <w:rPr>
+          <w:rFonts w:hint="default" w:ascii="Arial" w:hAnsi="Arial" w:cs="Arial"/>
+          <w:sz w:val="22"/>
+          <w:szCs w:val="22"/>
+          <w:lang w:val="en-US" w:eastAsia="zh-CN"/>
+        </w:rPr>
+      </w:pPr>
+    </w:p>
+    <w:p>
+      <w:pPr>
+        <w:bidi w:val="0"/>
+        <w:spacing w:line="240" w:lineRule="auto"/>
+        <w:jc w:val="both"/>
+        <w:rPr>
+          <w:rFonts w:hint="default" w:ascii="Arial" w:hAnsi="Arial" w:cs="Arial"/>
+          <w:sz w:val="22"/>
+          <w:szCs w:val="22"/>
+          <w:lang w:val="en-US" w:eastAsia="zh-CN"/>
+        </w:rPr>
+      </w:pPr>
+    </w:p>
+    <w:p>
+      <w:pPr>
+        <w:bidi w:val="0"/>
+        <w:spacing w:line="240" w:lineRule="auto"/>
+        <w:jc w:val="both"/>
+        <w:rPr>
+          <w:rFonts w:hint="default" w:ascii="Arial" w:hAnsi="Arial" w:cs="Arial"/>
+          <w:sz w:val="22"/>
+          <w:szCs w:val="22"/>
+          <w:lang w:val="en-US" w:eastAsia="zh-CN"/>
+        </w:rPr>
+      </w:pPr>
+    </w:p>
+    <w:p>
+      <w:pPr>
+        <w:bidi w:val="0"/>
+        <w:spacing w:line="240" w:lineRule="auto"/>
+        <w:jc w:val="both"/>
+        <w:rPr>
+          <w:rFonts w:hint="default" w:ascii="Arial" w:hAnsi="Arial" w:cs="Arial"/>
+          <w:sz w:val="22"/>
+          <w:szCs w:val="22"/>
+        </w:rPr>
+      </w:pPr>
+    </w:p>
+    <w:p>
+      <w:pPr>
+        <w:bidi w:val="0"/>
+        <w:spacing w:line="240" w:lineRule="auto"/>
+        <w:jc w:val="both"/>
+        <w:rPr>
+          <w:rFonts w:hint="default" w:ascii="Arial" w:hAnsi="Arial" w:cs="Arial"/>
+          <w:sz w:val="22"/>
+          <w:szCs w:val="22"/>
+        </w:rPr>
+      </w:pPr>
+    </w:p>
+    <w:p>
+      <w:pPr>
+        <w:bidi w:val="0"/>
+        <w:spacing w:line="240" w:lineRule="auto"/>
+        <w:jc w:val="both"/>
+        <w:rPr>
+          <w:rFonts w:hint="default" w:ascii="Arial" w:hAnsi="Arial" w:cs="Arial"/>
+          <w:sz w:val="22"/>
+          <w:szCs w:val="22"/>
+        </w:rPr>
+      </w:pPr>
+      <w:r>
+        <w:rPr>
+          <w:rFonts w:hint="default" w:ascii="Arial" w:hAnsi="Arial" w:cs="Arial"/>
+          <w:sz w:val="22"/>
+          <w:szCs w:val="22"/>
+          <w:lang w:val="en-US" w:eastAsia="zh-CN"/>
+        </w:rPr>
+        <w:t>Here is the completed table translated into English based strictly on the provided context:</w:t>
+      </w:r>
+    </w:p>
+    <w:p>
+      <w:pPr>
+        <w:bidi w:val="0"/>
+        <w:spacing w:line="240" w:lineRule="auto"/>
+        <w:jc w:val="both"/>
+        <w:rPr>
+          <w:rFonts w:hint="default" w:ascii="Arial" w:hAnsi="Arial" w:cs="Arial"/>
+          <w:sz w:val="22"/>
+          <w:szCs w:val="22"/>
+        </w:rPr>
+      </w:pPr>
+    </w:p>
     <w:tbl>
       <w:tblPr>
-        <w:tblStyle w:val="9"/>
         <w:tblW w:w="0" w:type="auto"/>
-        <w:tblInd w:w="0" w:type="dxa"/>
+        <w:tblCellSpacing w:w="15" w:type="dxa"/>
+        <w:tblInd w:w="10" w:type="dxa"/>
         <w:tblBorders>
-          <w:top w:val="none" w:color="auto" w:sz="0" w:space="0"/>
-          <w:left w:val="none" w:color="auto" w:sz="0" w:space="0"/>
-          <w:bottom w:val="none" w:color="auto" w:sz="0" w:space="0"/>
-          <w:right w:val="none" w:color="auto" w:sz="0" w:space="0"/>
+          <w:top w:val="none" w:color="1F1F1F" w:sz="0" w:space="0"/>
+          <w:left w:val="none" w:color="1F1F1F" w:sz="0" w:space="0"/>
+          <w:bottom w:val="none" w:color="1F1F1F" w:sz="0" w:space="0"/>
+          <w:right w:val="none" w:color="1F1F1F" w:sz="0" w:space="0"/>
           <w:insideH w:val="none" w:color="auto" w:sz="0" w:space="0"/>
           <w:insideV w:val="none" w:color="auto" w:sz="0" w:space="0"/>
         </w:tblBorders>
-        <w:shd w:val="clear" w:color="auto" w:fill="auto"/>
+        <w:shd w:val="clear"/>
         <w:tblLayout w:type="autofit"/>
         <w:tblCellMar>
-          <w:top w:w="15" w:type="dxa"/>
-          <w:left w:w="15" w:type="dxa"/>
-          <w:bottom w:w="15" w:type="dxa"/>
-          <w:right w:w="15" w:type="dxa"/>
+          <w:top w:w="0" w:type="dxa"/>
+          <w:left w:w="0" w:type="dxa"/>
+          <w:bottom w:w="0" w:type="dxa"/>
+          <w:right w:w="0" w:type="dxa"/>
         </w:tblCellMar>
       </w:tblPr>
       <w:tblGrid>
-        <w:gridCol w:w="1734"/>
-        <w:gridCol w:w="3377"/>
-        <w:gridCol w:w="2764"/>
-        <w:gridCol w:w="1979"/>
+        <w:gridCol w:w="2749"/>
+        <w:gridCol w:w="7319"/>
       </w:tblGrid>
       <w:tr>
         <w:tblPrEx>
           <w:tblBorders>
-            <w:top w:val="none" w:color="auto" w:sz="0" w:space="0"/>
-            <w:left w:val="none" w:color="auto" w:sz="0" w:space="0"/>
-            <w:bottom w:val="none" w:color="auto" w:sz="0" w:space="0"/>
-            <w:right w:val="none" w:color="auto" w:sz="0" w:space="0"/>
+            <w:top w:val="none" w:color="1F1F1F" w:sz="0" w:space="0"/>
+            <w:left w:val="none" w:color="1F1F1F" w:sz="0" w:space="0"/>
+            <w:bottom w:val="none" w:color="1F1F1F" w:sz="0" w:space="0"/>
+            <w:right w:val="none" w:color="1F1F1F" w:sz="0" w:space="0"/>
             <w:insideH w:val="none" w:color="auto" w:sz="0" w:space="0"/>
             <w:insideV w:val="none" w:color="auto" w:sz="0" w:space="0"/>
           </w:tblBorders>
-          <w:shd w:val="clear" w:color="auto" w:fill="auto"/>
+          <w:shd w:val="clear"/>
           <w:tblCellMar>
-            <w:top w:w="15" w:type="dxa"/>
-            <w:left w:w="15" w:type="dxa"/>
-            <w:bottom w:w="15" w:type="dxa"/>
-            <w:right w:w="15" w:type="dxa"/>
+            <w:top w:w="0" w:type="dxa"/>
+            <w:left w:w="0" w:type="dxa"/>
+            <w:bottom w:w="0" w:type="dxa"/>
+            <w:right w:w="0" w:type="dxa"/>
           </w:tblCellMar>
         </w:tblPrEx>
         <w:trPr>
-          <w:trHeight w:val="0" w:hRule="atLeast"/>
+          <w:tblHeader/>
+          <w:tblCellSpacing w:w="15" w:type="dxa"/>
         </w:trPr>
         <w:tc>
           <w:tcPr>
-            <w:tcW w:w="0" w:type="auto"/>
+            <w:tcW w:w="2621" w:type="dxa"/>
             <w:tcBorders>
-              <w:top w:val="single" w:color="000000" w:sz="4" w:space="0"/>
-              <w:left w:val="single" w:color="000000" w:sz="4" w:space="0"/>
-              <w:bottom w:val="single" w:color="000000" w:sz="4" w:space="0"/>
-              <w:right w:val="single" w:color="000000" w:sz="4" w:space="0"/>
+              <w:top w:val="single" w:color="C4C7C5" w:sz="4" w:space="0"/>
+              <w:left w:val="single" w:color="C4C7C5" w:sz="4" w:space="0"/>
+              <w:bottom w:val="single" w:color="C4C7C5" w:sz="4" w:space="0"/>
+              <w:right w:val="single" w:color="C4C7C5" w:sz="4" w:space="0"/>
             </w:tcBorders>
-            <w:shd w:val="clear" w:color="auto" w:fill="auto"/>
+            <w:shd w:val="clear"/>
             <w:tcMar>
-              <w:top w:w="0" w:type="dxa"/>
-              <w:left w:w="108" w:type="dxa"/>
-              <w:bottom w:w="0" w:type="dxa"/>
-              <w:right w:w="108" w:type="dxa"/>
+              <w:top w:w="120" w:type="dxa"/>
+              <w:left w:w="180" w:type="dxa"/>
+              <w:bottom w:w="120" w:type="dxa"/>
+              <w:right w:w="180" w:type="dxa"/>
             </w:tcMar>
             <w:vAlign w:val="center"/>
           </w:tcPr>
@@ -6533,26 +6692,27 @@
                 <w:rFonts w:hint="default" w:ascii="Arial" w:hAnsi="Arial" w:cs="Arial"/>
                 <w:sz w:val="22"/>
                 <w:szCs w:val="22"/>
-              </w:rPr>
-              <w:t>AI competence</w:t>
+                <w:lang w:val="en-US" w:eastAsia="zh-CN"/>
+              </w:rPr>
+              <w:t>Reflective prompts (to students)</w:t>
             </w:r>
           </w:p>
         </w:tc>
         <w:tc>
           <w:tcPr>
-            <w:tcW w:w="0" w:type="auto"/>
+            <w:tcW w:w="7357" w:type="dxa"/>
             <w:tcBorders>
-              <w:top w:val="single" w:color="000000" w:sz="4" w:space="0"/>
-              <w:left w:val="single" w:color="000000" w:sz="4" w:space="0"/>
-              <w:bottom w:val="single" w:color="000000" w:sz="4" w:space="0"/>
-              <w:right w:val="single" w:color="000000" w:sz="4" w:space="0"/>
+              <w:top w:val="single" w:color="C4C7C5" w:sz="4" w:space="0"/>
+              <w:left w:val="single" w:color="C4C7C5" w:sz="4" w:space="0"/>
+              <w:bottom w:val="single" w:color="C4C7C5" w:sz="4" w:space="0"/>
+              <w:right w:val="single" w:color="C4C7C5" w:sz="4" w:space="0"/>
             </w:tcBorders>
-            <w:shd w:val="clear" w:color="auto" w:fill="auto"/>
+            <w:shd w:val="clear"/>
             <w:tcMar>
-              <w:top w:w="0" w:type="dxa"/>
-              <w:left w:w="108" w:type="dxa"/>
-              <w:bottom w:w="0" w:type="dxa"/>
-              <w:right w:w="108" w:type="dxa"/>
+              <w:top w:w="120" w:type="dxa"/>
+              <w:left w:w="180" w:type="dxa"/>
+              <w:bottom w:w="120" w:type="dxa"/>
+              <w:right w:w="180" w:type="dxa"/>
             </w:tcMar>
             <w:vAlign w:val="center"/>
           </w:tcPr>
@@ -6572,86 +6732,9 @@
                 <w:rFonts w:hint="default" w:ascii="Arial" w:hAnsi="Arial" w:cs="Arial"/>
                 <w:sz w:val="22"/>
                 <w:szCs w:val="22"/>
-              </w:rPr>
-              <w:t>Reflective prompts (to students)</w:t>
-            </w:r>
-          </w:p>
-        </w:tc>
-        <w:tc>
-          <w:tcPr>
-            <w:tcW w:w="0" w:type="auto"/>
-            <w:tcBorders>
-              <w:top w:val="single" w:color="000000" w:sz="4" w:space="0"/>
-              <w:left w:val="single" w:color="000000" w:sz="4" w:space="0"/>
-              <w:bottom w:val="single" w:color="000000" w:sz="4" w:space="0"/>
-              <w:right w:val="single" w:color="000000" w:sz="4" w:space="0"/>
-            </w:tcBorders>
-            <w:shd w:val="clear" w:color="auto" w:fill="auto"/>
-            <w:tcMar>
-              <w:top w:w="0" w:type="dxa"/>
-              <w:left w:w="108" w:type="dxa"/>
-              <w:bottom w:w="0" w:type="dxa"/>
-              <w:right w:w="108" w:type="dxa"/>
-            </w:tcMar>
-            <w:vAlign w:val="center"/>
-          </w:tcPr>
-          <w:p>
-            <w:pPr>
-              <w:bidi w:val="0"/>
-              <w:spacing w:line="240" w:lineRule="auto"/>
-              <w:jc w:val="both"/>
-              <w:rPr>
-                <w:rFonts w:hint="default" w:ascii="Arial" w:hAnsi="Arial" w:cs="Arial"/>
-                <w:sz w:val="22"/>
-                <w:szCs w:val="22"/>
-              </w:rPr>
-            </w:pPr>
-            <w:r>
-              <w:rPr>
-                <w:rFonts w:hint="default" w:ascii="Arial" w:hAnsi="Arial" w:cs="Arial"/>
-                <w:sz w:val="22"/>
-                <w:szCs w:val="22"/>
-              </w:rPr>
-              <w:t>Lecturer expectations</w:t>
-            </w:r>
-          </w:p>
-        </w:tc>
-        <w:tc>
-          <w:tcPr>
-            <w:tcW w:w="0" w:type="auto"/>
-            <w:tcBorders>
-              <w:top w:val="single" w:color="000000" w:sz="4" w:space="0"/>
-              <w:left w:val="single" w:color="000000" w:sz="4" w:space="0"/>
-              <w:bottom w:val="single" w:color="000000" w:sz="4" w:space="0"/>
-              <w:right w:val="single" w:color="000000" w:sz="4" w:space="0"/>
-            </w:tcBorders>
-            <w:shd w:val="clear" w:color="auto" w:fill="auto"/>
-            <w:tcMar>
-              <w:top w:w="0" w:type="dxa"/>
-              <w:left w:w="108" w:type="dxa"/>
-              <w:bottom w:w="0" w:type="dxa"/>
-              <w:right w:w="108" w:type="dxa"/>
-            </w:tcMar>
-            <w:vAlign w:val="center"/>
-          </w:tcPr>
-          <w:p>
-            <w:pPr>
-              <w:bidi w:val="0"/>
-              <w:spacing w:line="240" w:lineRule="auto"/>
-              <w:jc w:val="both"/>
-              <w:rPr>
-                <w:rFonts w:hint="default" w:ascii="Arial" w:hAnsi="Arial" w:cs="Arial"/>
-                <w:sz w:val="22"/>
-                <w:szCs w:val="22"/>
-              </w:rPr>
-            </w:pPr>
-            <w:r>
-              <w:rPr>
-                <w:rFonts w:hint="default" w:ascii="Arial" w:hAnsi="Arial" w:cs="Arial"/>
-                <w:sz w:val="22"/>
-                <w:szCs w:val="22"/>
-              </w:rPr>
-              <w:t>Student response</w:t>
+                <w:lang w:val="en-US" w:eastAsia="zh-CN"/>
+              </w:rPr>
+              <w:t>Response / Reflection</w:t>
             </w:r>
           </w:p>
         </w:tc>
@@ -6659,41 +6742,41 @@
       <w:tr>
         <w:tblPrEx>
           <w:tblBorders>
-            <w:top w:val="none" w:color="auto" w:sz="0" w:space="0"/>
-            <w:left w:val="none" w:color="auto" w:sz="0" w:space="0"/>
-            <w:bottom w:val="none" w:color="auto" w:sz="0" w:space="0"/>
-            <w:right w:val="none" w:color="auto" w:sz="0" w:space="0"/>
+            <w:top w:val="none" w:color="1F1F1F" w:sz="0" w:space="0"/>
+            <w:left w:val="none" w:color="1F1F1F" w:sz="0" w:space="0"/>
+            <w:bottom w:val="none" w:color="1F1F1F" w:sz="0" w:space="0"/>
+            <w:right w:val="none" w:color="1F1F1F" w:sz="0" w:space="0"/>
             <w:insideH w:val="none" w:color="auto" w:sz="0" w:space="0"/>
             <w:insideV w:val="none" w:color="auto" w:sz="0" w:space="0"/>
           </w:tblBorders>
-          <w:shd w:val="clear" w:color="auto" w:fill="auto"/>
+          <w:shd w:val="clear"/>
           <w:tblCellMar>
-            <w:top w:w="15" w:type="dxa"/>
-            <w:left w:w="15" w:type="dxa"/>
-            <w:bottom w:w="15" w:type="dxa"/>
-            <w:right w:w="15" w:type="dxa"/>
+            <w:top w:w="0" w:type="dxa"/>
+            <w:left w:w="0" w:type="dxa"/>
+            <w:bottom w:w="0" w:type="dxa"/>
+            <w:right w:w="0" w:type="dxa"/>
           </w:tblCellMar>
         </w:tblPrEx>
         <w:trPr>
-          <w:trHeight w:val="0" w:hRule="atLeast"/>
+          <w:tblCellSpacing w:w="15" w:type="dxa"/>
         </w:trPr>
         <w:tc>
           <w:tcPr>
-            <w:tcW w:w="0" w:type="auto"/>
+            <w:tcW w:w="2621" w:type="dxa"/>
             <w:tcBorders>
-              <w:top w:val="single" w:color="000000" w:sz="4" w:space="0"/>
-              <w:left w:val="single" w:color="000000" w:sz="4" w:space="0"/>
-              <w:bottom w:val="single" w:color="000000" w:sz="4" w:space="0"/>
-              <w:right w:val="single" w:color="000000" w:sz="4" w:space="0"/>
+              <w:top w:val="single" w:color="C4C7C5" w:sz="4" w:space="0"/>
+              <w:left w:val="single" w:color="C4C7C5" w:sz="4" w:space="0"/>
+              <w:bottom w:val="single" w:color="C4C7C5" w:sz="4" w:space="0"/>
+              <w:right w:val="single" w:color="C4C7C5" w:sz="4" w:space="0"/>
             </w:tcBorders>
-            <w:shd w:val="clear" w:color="auto" w:fill="auto"/>
+            <w:shd w:val="clear"/>
             <w:tcMar>
-              <w:top w:w="0" w:type="dxa"/>
-              <w:left w:w="108" w:type="dxa"/>
-              <w:bottom w:w="0" w:type="dxa"/>
-              <w:right w:w="108" w:type="dxa"/>
+              <w:top w:w="120" w:type="dxa"/>
+              <w:left w:w="180" w:type="dxa"/>
+              <w:bottom w:w="120" w:type="dxa"/>
+              <w:right w:w="180" w:type="dxa"/>
             </w:tcMar>
-            <w:vAlign w:val="top"/>
+            <w:vAlign w:val="center"/>
           </w:tcPr>
           <w:p>
             <w:pPr>
@@ -6711,48 +6794,92 @@
                 <w:rFonts w:hint="default" w:ascii="Arial" w:hAnsi="Arial" w:cs="Arial"/>
                 <w:sz w:val="22"/>
                 <w:szCs w:val="22"/>
+                <w:lang w:val="en-US" w:eastAsia="zh-CN"/>
               </w:rPr>
               <w:t>Delegation</w:t>
             </w:r>
-          </w:p>
-          <w:p>
-            <w:pPr>
-              <w:bidi w:val="0"/>
-              <w:spacing w:line="240" w:lineRule="auto"/>
-              <w:jc w:val="both"/>
-              <w:rPr>
-                <w:rFonts w:hint="default" w:ascii="Arial" w:hAnsi="Arial" w:cs="Arial"/>
-                <w:sz w:val="22"/>
-                <w:szCs w:val="22"/>
-              </w:rPr>
-            </w:pPr>
-            <w:r>
-              <w:rPr>
-                <w:rFonts w:hint="default" w:ascii="Arial" w:hAnsi="Arial" w:cs="Arial"/>
-                <w:sz w:val="22"/>
-                <w:szCs w:val="22"/>
+            <w:r>
+              <w:rPr>
+                <w:rFonts w:hint="default" w:ascii="Arial" w:hAnsi="Arial" w:cs="Arial"/>
+                <w:sz w:val="22"/>
+                <w:szCs w:val="22"/>
+                <w:lang w:val="en-GB" w:eastAsia="zh-CN"/>
+              </w:rPr>
+              <w:t>.</w:t>
+            </w:r>
+            <w:r>
+              <w:rPr>
+                <w:rFonts w:hint="default" w:ascii="Arial" w:hAnsi="Arial" w:cs="Arial"/>
+                <w:sz w:val="22"/>
+                <w:szCs w:val="22"/>
+                <w:lang w:val="en-US" w:eastAsia="zh-CN"/>
               </w:rPr>
               <w:t>Deciding whether &amp; when to use AI</w:t>
             </w:r>
+          </w:p>
+          <w:p>
+            <w:pPr>
+              <w:bidi w:val="0"/>
+              <w:spacing w:line="240" w:lineRule="auto"/>
+              <w:jc w:val="both"/>
+              <w:rPr>
+                <w:rFonts w:hint="default" w:ascii="Arial" w:hAnsi="Arial" w:cs="Arial"/>
+                <w:sz w:val="22"/>
+                <w:szCs w:val="22"/>
+              </w:rPr>
+            </w:pPr>
+          </w:p>
+          <w:p>
+            <w:pPr>
+              <w:bidi w:val="0"/>
+              <w:spacing w:line="240" w:lineRule="auto"/>
+              <w:jc w:val="both"/>
+              <w:rPr>
+                <w:rFonts w:hint="default" w:ascii="Arial" w:hAnsi="Arial" w:cs="Arial"/>
+                <w:sz w:val="22"/>
+                <w:szCs w:val="22"/>
+              </w:rPr>
+            </w:pPr>
+            <w:r>
+              <w:rPr>
+                <w:rFonts w:hint="default" w:ascii="Arial" w:hAnsi="Arial" w:cs="Arial"/>
+                <w:sz w:val="22"/>
+                <w:szCs w:val="22"/>
+                <w:lang w:val="en-US" w:eastAsia="zh-CN"/>
+              </w:rPr>
+              <w:t>Identify the specific tasks in this assessment where you chose to use AI, and explain your reasoning. Where did AI add value? Where did you decide not to use it, and why?</w:t>
+            </w:r>
+          </w:p>
+          <w:p>
+            <w:pPr>
+              <w:bidi w:val="0"/>
+              <w:spacing w:line="240" w:lineRule="auto"/>
+              <w:jc w:val="both"/>
+              <w:rPr>
+                <w:rFonts w:hint="default" w:ascii="Arial" w:hAnsi="Arial" w:cs="Arial"/>
+                <w:sz w:val="22"/>
+                <w:szCs w:val="22"/>
+              </w:rPr>
+            </w:pPr>
           </w:p>
         </w:tc>
         <w:tc>
           <w:tcPr>
-            <w:tcW w:w="0" w:type="auto"/>
+            <w:tcW w:w="7357" w:type="dxa"/>
             <w:tcBorders>
-              <w:top w:val="single" w:color="000000" w:sz="4" w:space="0"/>
-              <w:left w:val="single" w:color="000000" w:sz="4" w:space="0"/>
-              <w:bottom w:val="single" w:color="000000" w:sz="4" w:space="0"/>
-              <w:right w:val="single" w:color="000000" w:sz="4" w:space="0"/>
+              <w:top w:val="single" w:color="C4C7C5" w:sz="4" w:space="0"/>
+              <w:left w:val="single" w:color="C4C7C5" w:sz="4" w:space="0"/>
+              <w:bottom w:val="single" w:color="C4C7C5" w:sz="4" w:space="0"/>
+              <w:right w:val="single" w:color="C4C7C5" w:sz="4" w:space="0"/>
             </w:tcBorders>
-            <w:shd w:val="clear" w:color="auto" w:fill="auto"/>
+            <w:shd w:val="clear"/>
             <w:tcMar>
-              <w:top w:w="0" w:type="dxa"/>
-              <w:left w:w="108" w:type="dxa"/>
-              <w:bottom w:w="0" w:type="dxa"/>
-              <w:right w:w="108" w:type="dxa"/>
+              <w:top w:w="120" w:type="dxa"/>
+              <w:left w:w="180" w:type="dxa"/>
+              <w:bottom w:w="120" w:type="dxa"/>
+              <w:right w:w="180" w:type="dxa"/>
             </w:tcMar>
-            <w:vAlign w:val="top"/>
+            <w:vAlign w:val="center"/>
           </w:tcPr>
           <w:p>
             <w:pPr>
@@ -6763,129 +6890,401 @@
                 <w:rFonts w:hint="default" w:ascii="Arial" w:hAnsi="Arial" w:cs="Arial"/>
                 <w:sz w:val="22"/>
                 <w:szCs w:val="22"/>
-              </w:rPr>
-            </w:pPr>
-            <w:r>
-              <w:rPr>
-                <w:rFonts w:hint="default" w:ascii="Arial" w:hAnsi="Arial" w:cs="Arial"/>
-                <w:sz w:val="22"/>
-                <w:szCs w:val="22"/>
-              </w:rPr>
-              <w:t>Identify the specific tasks in this assessment where you chose to use AI, and explain your reasoning. Where did AI add value? Where did you decide not to use it, and why?</w:t>
-            </w:r>
-          </w:p>
-        </w:tc>
-        <w:tc>
-          <w:tcPr>
-            <w:tcW w:w="0" w:type="auto"/>
-            <w:tcBorders>
-              <w:top w:val="single" w:color="000000" w:sz="4" w:space="0"/>
-              <w:left w:val="single" w:color="000000" w:sz="4" w:space="0"/>
-              <w:bottom w:val="single" w:color="000000" w:sz="4" w:space="0"/>
-              <w:right w:val="single" w:color="000000" w:sz="4" w:space="0"/>
-            </w:tcBorders>
-            <w:shd w:val="clear" w:color="auto" w:fill="auto"/>
-            <w:tcMar>
-              <w:top w:w="0" w:type="dxa"/>
-              <w:left w:w="108" w:type="dxa"/>
-              <w:bottom w:w="0" w:type="dxa"/>
-              <w:right w:w="108" w:type="dxa"/>
-            </w:tcMar>
-            <w:vAlign w:val="top"/>
-          </w:tcPr>
-          <w:p>
-            <w:pPr>
-              <w:bidi w:val="0"/>
-              <w:spacing w:line="240" w:lineRule="auto"/>
-              <w:jc w:val="both"/>
-              <w:rPr>
-                <w:rFonts w:hint="default" w:ascii="Arial" w:hAnsi="Arial" w:cs="Arial"/>
-                <w:sz w:val="22"/>
-                <w:szCs w:val="22"/>
-              </w:rPr>
-            </w:pPr>
-          </w:p>
-          <w:p>
-            <w:pPr>
-              <w:bidi w:val="0"/>
-              <w:spacing w:line="240" w:lineRule="auto"/>
-              <w:jc w:val="both"/>
-              <w:rPr>
-                <w:rFonts w:hint="default" w:ascii="Arial" w:hAnsi="Arial" w:cs="Arial"/>
-                <w:sz w:val="22"/>
-                <w:szCs w:val="22"/>
-              </w:rPr>
-            </w:pPr>
-            <w:r>
-              <w:rPr>
-                <w:rFonts w:hint="default" w:ascii="Arial" w:hAnsi="Arial" w:cs="Arial"/>
-                <w:sz w:val="22"/>
-                <w:szCs w:val="22"/>
-              </w:rPr>
-              <w:t>You may use AI to support your learning and development of the application. Clearly identify where you used AI and where you completed the work independently.</w:t>
-            </w:r>
-          </w:p>
-          <w:p>
-            <w:pPr>
-              <w:bidi w:val="0"/>
-              <w:spacing w:line="240" w:lineRule="auto"/>
-              <w:jc w:val="both"/>
-              <w:rPr>
-                <w:rFonts w:hint="default" w:ascii="Arial" w:hAnsi="Arial" w:cs="Arial"/>
-                <w:sz w:val="22"/>
-                <w:szCs w:val="22"/>
-              </w:rPr>
-            </w:pPr>
-          </w:p>
-          <w:p>
-            <w:pPr>
-              <w:bidi w:val="0"/>
-              <w:spacing w:line="240" w:lineRule="auto"/>
-              <w:jc w:val="both"/>
-              <w:rPr>
-                <w:rFonts w:hint="default" w:ascii="Arial" w:hAnsi="Arial" w:cs="Arial"/>
-                <w:sz w:val="22"/>
-                <w:szCs w:val="22"/>
-              </w:rPr>
-            </w:pPr>
-          </w:p>
-        </w:tc>
-        <w:tc>
-          <w:tcPr>
-            <w:tcW w:w="0" w:type="auto"/>
-            <w:tcBorders>
-              <w:top w:val="single" w:color="000000" w:sz="4" w:space="0"/>
-              <w:left w:val="single" w:color="000000" w:sz="4" w:space="0"/>
-              <w:bottom w:val="single" w:color="000000" w:sz="4" w:space="0"/>
-              <w:right w:val="single" w:color="000000" w:sz="4" w:space="0"/>
-            </w:tcBorders>
-            <w:shd w:val="clear" w:color="auto" w:fill="auto"/>
-            <w:tcMar>
-              <w:top w:w="0" w:type="dxa"/>
-              <w:left w:w="108" w:type="dxa"/>
-              <w:bottom w:w="0" w:type="dxa"/>
-              <w:right w:w="108" w:type="dxa"/>
-            </w:tcMar>
-            <w:vAlign w:val="top"/>
-          </w:tcPr>
-          <w:p>
-            <w:pPr>
-              <w:bidi w:val="0"/>
-              <w:spacing w:line="240" w:lineRule="auto"/>
-              <w:jc w:val="both"/>
-              <w:rPr>
-                <w:rFonts w:hint="default" w:ascii="Arial" w:hAnsi="Arial" w:cs="Arial"/>
-                <w:sz w:val="22"/>
-                <w:szCs w:val="22"/>
-              </w:rPr>
-            </w:pPr>
-            <w:r>
-              <w:rPr>
-                <w:rFonts w:hint="default" w:ascii="Arial" w:hAnsi="Arial" w:cs="Arial"/>
-                <w:sz w:val="22"/>
-                <w:szCs w:val="22"/>
-              </w:rPr>
-              <w:t>Briefly state which parts of your application assessment you used AI for and why.</w:t>
+                <w:lang w:val="en-GB"/>
+              </w:rPr>
+            </w:pPr>
+            <w:r>
+              <w:rPr>
+                <w:rFonts w:hint="default" w:ascii="Arial" w:hAnsi="Arial" w:cs="Arial"/>
+                <w:sz w:val="22"/>
+                <w:szCs w:val="22"/>
+                <w:lang w:val="en-GB" w:eastAsia="zh-CN"/>
+              </w:rPr>
+              <w:t>I used AI in the following tasks:</w:t>
+            </w:r>
+          </w:p>
+          <w:p>
+            <w:pPr>
+              <w:bidi w:val="0"/>
+              <w:spacing w:line="240" w:lineRule="auto"/>
+              <w:jc w:val="both"/>
+              <w:rPr>
+                <w:rFonts w:hint="default" w:ascii="Arial" w:hAnsi="Arial" w:cs="Arial"/>
+                <w:sz w:val="22"/>
+                <w:szCs w:val="22"/>
+              </w:rPr>
+            </w:pPr>
+            <w:r>
+              <w:rPr>
+                <w:rFonts w:hint="default" w:ascii="Arial" w:hAnsi="Arial" w:cs="Arial"/>
+                <w:sz w:val="22"/>
+                <w:szCs w:val="22"/>
+                <w:lang w:val="en-US" w:eastAsia="zh-CN"/>
+              </w:rPr>
+              <w:t xml:space="preserve">To synthesize and structure data from studies and databases. </w:t>
+            </w:r>
+          </w:p>
+          <w:p>
+            <w:pPr>
+              <w:bidi w:val="0"/>
+              <w:spacing w:line="240" w:lineRule="auto"/>
+              <w:jc w:val="both"/>
+              <w:rPr>
+                <w:rFonts w:hint="default" w:ascii="Arial" w:hAnsi="Arial" w:cs="Arial"/>
+                <w:sz w:val="22"/>
+                <w:szCs w:val="22"/>
+              </w:rPr>
+            </w:pPr>
+            <w:r>
+              <w:rPr>
+                <w:rFonts w:hint="default" w:ascii="Arial" w:hAnsi="Arial" w:cs="Arial"/>
+                <w:sz w:val="22"/>
+                <w:szCs w:val="22"/>
+                <w:lang w:val="en-US" w:eastAsia="zh-CN"/>
+              </w:rPr>
+              <w:t xml:space="preserve">For drafting, transcribing audio from Spanish into English, and direct translation. </w:t>
+            </w:r>
+          </w:p>
+          <w:p>
+            <w:pPr>
+              <w:bidi w:val="0"/>
+              <w:spacing w:line="240" w:lineRule="auto"/>
+              <w:jc w:val="both"/>
+              <w:rPr>
+                <w:rFonts w:hint="default" w:ascii="Arial" w:hAnsi="Arial" w:cs="Arial"/>
+                <w:sz w:val="22"/>
+                <w:szCs w:val="22"/>
+              </w:rPr>
+            </w:pPr>
+            <w:r>
+              <w:rPr>
+                <w:rFonts w:hint="default" w:ascii="Arial" w:hAnsi="Arial" w:cs="Arial"/>
+                <w:sz w:val="22"/>
+                <w:szCs w:val="22"/>
+                <w:lang w:val="en-US" w:eastAsia="zh-CN"/>
+              </w:rPr>
+              <w:t>To ask questions regarding machine learning and its scope on topics not deeply covered in class</w:t>
+            </w:r>
+            <w:r>
+              <w:rPr>
+                <w:rFonts w:hint="default" w:ascii="Arial" w:hAnsi="Arial" w:cs="Arial"/>
+                <w:sz w:val="22"/>
+                <w:szCs w:val="22"/>
+                <w:lang w:val="en-GB" w:eastAsia="zh-CN"/>
+              </w:rPr>
+              <w:t xml:space="preserve"> yet</w:t>
+            </w:r>
+            <w:r>
+              <w:rPr>
+                <w:rFonts w:hint="default" w:ascii="Arial" w:hAnsi="Arial" w:cs="Arial"/>
+                <w:sz w:val="22"/>
+                <w:szCs w:val="22"/>
+                <w:lang w:val="en-US" w:eastAsia="zh-CN"/>
+              </w:rPr>
+              <w:t xml:space="preserve">. </w:t>
+            </w:r>
+          </w:p>
+          <w:p>
+            <w:pPr>
+              <w:bidi w:val="0"/>
+              <w:spacing w:line="240" w:lineRule="auto"/>
+              <w:jc w:val="both"/>
+              <w:rPr>
+                <w:rFonts w:hint="default" w:ascii="Arial" w:hAnsi="Arial" w:cs="Arial"/>
+                <w:sz w:val="22"/>
+                <w:szCs w:val="22"/>
+              </w:rPr>
+            </w:pPr>
+            <w:r>
+              <w:rPr>
+                <w:rFonts w:hint="default" w:ascii="Arial" w:hAnsi="Arial" w:cs="Arial"/>
+                <w:sz w:val="22"/>
+                <w:szCs w:val="22"/>
+                <w:lang w:val="en-US" w:eastAsia="zh-CN"/>
+              </w:rPr>
+              <w:t xml:space="preserve">To convert bibliographic citation formats from APA to Harvard. </w:t>
+            </w:r>
+          </w:p>
+          <w:p>
+            <w:pPr>
+              <w:bidi w:val="0"/>
+              <w:spacing w:line="240" w:lineRule="auto"/>
+              <w:jc w:val="both"/>
+              <w:rPr>
+                <w:rFonts w:hint="default" w:ascii="Arial" w:hAnsi="Arial" w:cs="Arial"/>
+                <w:sz w:val="22"/>
+                <w:szCs w:val="22"/>
+              </w:rPr>
+            </w:pPr>
+            <w:r>
+              <w:rPr>
+                <w:rFonts w:hint="default" w:ascii="Arial" w:hAnsi="Arial" w:cs="Arial"/>
+                <w:sz w:val="22"/>
+                <w:szCs w:val="22"/>
+                <w:lang w:val="en-US" w:eastAsia="zh-CN"/>
+              </w:rPr>
+              <w:t xml:space="preserve">In the initial phase for brainstorming, connecting concepts, and evaluating the project's feasibility or complexity. </w:t>
+            </w:r>
+            <w:r>
+              <w:rPr>
+                <w:rFonts w:hint="default" w:ascii="Arial" w:hAnsi="Arial" w:cs="Arial"/>
+                <w:sz w:val="22"/>
+                <w:szCs w:val="22"/>
+                <w:lang w:val="en-US" w:eastAsia="zh-CN"/>
+              </w:rPr>
+              <w:br w:type="textWrapping"/>
+            </w:r>
+          </w:p>
+          <w:p>
+            <w:pPr>
+              <w:bidi w:val="0"/>
+              <w:spacing w:line="240" w:lineRule="auto"/>
+              <w:jc w:val="both"/>
+              <w:rPr>
+                <w:rFonts w:hint="default" w:ascii="Arial" w:hAnsi="Arial" w:cs="Arial"/>
+                <w:sz w:val="22"/>
+                <w:szCs w:val="22"/>
+              </w:rPr>
+            </w:pPr>
+            <w:r>
+              <w:rPr>
+                <w:rFonts w:hint="default" w:ascii="Arial" w:hAnsi="Arial" w:cs="Arial"/>
+                <w:sz w:val="22"/>
+                <w:szCs w:val="22"/>
+                <w:lang w:val="en-GB" w:eastAsia="zh-CN"/>
+              </w:rPr>
+              <w:t>The v</w:t>
+            </w:r>
+            <w:r>
+              <w:rPr>
+                <w:rFonts w:hint="default" w:ascii="Arial" w:hAnsi="Arial" w:cs="Arial"/>
+                <w:sz w:val="22"/>
+                <w:szCs w:val="22"/>
+                <w:lang w:val="en-US" w:eastAsia="zh-CN"/>
+              </w:rPr>
+              <w:t>alue added</w:t>
+            </w:r>
+            <w:r>
+              <w:rPr>
+                <w:rFonts w:hint="default" w:ascii="Arial" w:hAnsi="Arial" w:cs="Arial"/>
+                <w:sz w:val="22"/>
+                <w:szCs w:val="22"/>
+                <w:lang w:val="en-GB" w:eastAsia="zh-CN"/>
+              </w:rPr>
+              <w:t xml:space="preserve"> was p</w:t>
+            </w:r>
+            <w:r>
+              <w:rPr>
+                <w:rFonts w:hint="default" w:ascii="Arial" w:hAnsi="Arial" w:cs="Arial"/>
+                <w:sz w:val="22"/>
+                <w:szCs w:val="22"/>
+                <w:lang w:val="en-US" w:eastAsia="zh-CN"/>
+              </w:rPr>
+              <w:t>rovided speed and time savings by</w:t>
+            </w:r>
+            <w:r>
+              <w:rPr>
+                <w:rFonts w:hint="default" w:ascii="Arial" w:hAnsi="Arial" w:cs="Arial"/>
+                <w:sz w:val="22"/>
+                <w:szCs w:val="22"/>
+                <w:lang w:val="en-GB" w:eastAsia="zh-CN"/>
+              </w:rPr>
+              <w:t xml:space="preserve"> doing</w:t>
+            </w:r>
+            <w:r>
+              <w:rPr>
+                <w:rFonts w:hint="default" w:ascii="Arial" w:hAnsi="Arial" w:cs="Arial"/>
+                <w:sz w:val="22"/>
+                <w:szCs w:val="22"/>
+                <w:lang w:val="en-US" w:eastAsia="zh-CN"/>
+              </w:rPr>
+              <w:t xml:space="preserve"> repetitive, and mechanical tasks (such as typing audio or copying/pasting links into tables). </w:t>
+            </w:r>
+            <w:r>
+              <w:rPr>
+                <w:rFonts w:hint="default" w:ascii="Arial" w:hAnsi="Arial" w:cs="Arial"/>
+                <w:sz w:val="22"/>
+                <w:szCs w:val="22"/>
+                <w:lang w:val="en-GB" w:eastAsia="zh-CN"/>
+              </w:rPr>
+              <w:t>The AI was h</w:t>
+            </w:r>
+            <w:r>
+              <w:rPr>
+                <w:rFonts w:hint="default" w:ascii="Arial" w:hAnsi="Arial" w:cs="Arial"/>
+                <w:sz w:val="22"/>
+                <w:szCs w:val="22"/>
+                <w:lang w:val="en-US" w:eastAsia="zh-CN"/>
+              </w:rPr>
+              <w:t>igh</w:t>
+            </w:r>
+            <w:r>
+              <w:rPr>
+                <w:rFonts w:hint="default" w:ascii="Arial" w:hAnsi="Arial" w:cs="Arial"/>
+                <w:sz w:val="22"/>
+                <w:szCs w:val="22"/>
+                <w:lang w:val="en-GB" w:eastAsia="zh-CN"/>
+              </w:rPr>
+              <w:t>ly</w:t>
+            </w:r>
+            <w:r>
+              <w:rPr>
+                <w:rFonts w:hint="default" w:ascii="Arial" w:hAnsi="Arial" w:cs="Arial"/>
+                <w:sz w:val="22"/>
+                <w:szCs w:val="22"/>
+                <w:lang w:val="en-US" w:eastAsia="zh-CN"/>
+              </w:rPr>
+              <w:t xml:space="preserve"> effectiv</w:t>
+            </w:r>
+            <w:r>
+              <w:rPr>
+                <w:rFonts w:hint="default" w:ascii="Arial" w:hAnsi="Arial" w:cs="Arial"/>
+                <w:sz w:val="22"/>
+                <w:szCs w:val="22"/>
+                <w:lang w:val="en-GB" w:eastAsia="zh-CN"/>
+              </w:rPr>
+              <w:t>e</w:t>
+            </w:r>
+            <w:r>
+              <w:rPr>
+                <w:rFonts w:hint="default" w:ascii="Arial" w:hAnsi="Arial" w:cs="Arial"/>
+                <w:sz w:val="22"/>
+                <w:szCs w:val="22"/>
+                <w:lang w:val="en-US" w:eastAsia="zh-CN"/>
+              </w:rPr>
+              <w:t xml:space="preserve"> in </w:t>
+            </w:r>
+            <w:r>
+              <w:rPr>
+                <w:rFonts w:hint="default" w:ascii="Arial" w:hAnsi="Arial" w:cs="Arial"/>
+                <w:sz w:val="22"/>
+                <w:szCs w:val="22"/>
+                <w:lang w:val="en-GB" w:eastAsia="zh-CN"/>
+              </w:rPr>
+              <w:t xml:space="preserve">this kind of stack related to process language. </w:t>
+            </w:r>
+          </w:p>
+          <w:p>
+            <w:pPr>
+              <w:bidi w:val="0"/>
+              <w:spacing w:line="240" w:lineRule="auto"/>
+              <w:jc w:val="both"/>
+              <w:rPr>
+                <w:rFonts w:hint="default" w:ascii="Arial" w:hAnsi="Arial" w:cs="Arial"/>
+                <w:sz w:val="22"/>
+                <w:szCs w:val="22"/>
+              </w:rPr>
+            </w:pPr>
+          </w:p>
+          <w:p>
+            <w:pPr>
+              <w:bidi w:val="0"/>
+              <w:spacing w:line="240" w:lineRule="auto"/>
+              <w:jc w:val="both"/>
+              <w:rPr>
+                <w:rFonts w:hint="default" w:ascii="Arial" w:hAnsi="Arial" w:cs="Arial"/>
+                <w:sz w:val="22"/>
+                <w:szCs w:val="22"/>
+              </w:rPr>
+            </w:pPr>
+            <w:r>
+              <w:rPr>
+                <w:rFonts w:hint="default" w:ascii="Arial" w:hAnsi="Arial" w:cs="Arial"/>
+                <w:sz w:val="22"/>
+                <w:szCs w:val="22"/>
+                <w:lang w:val="en-US" w:eastAsia="zh-CN"/>
+              </w:rPr>
+              <w:t xml:space="preserve">It was not used to ask for technical </w:t>
+            </w:r>
+            <w:r>
+              <w:rPr>
+                <w:rFonts w:hint="default" w:ascii="Arial" w:hAnsi="Arial" w:cs="Arial"/>
+                <w:sz w:val="22"/>
+                <w:szCs w:val="22"/>
+                <w:lang w:val="en-GB" w:eastAsia="zh-CN"/>
+              </w:rPr>
+              <w:t xml:space="preserve">guide </w:t>
+            </w:r>
+            <w:r>
+              <w:rPr>
+                <w:rFonts w:hint="default" w:ascii="Arial" w:hAnsi="Arial" w:cs="Arial"/>
+                <w:sz w:val="22"/>
+                <w:szCs w:val="22"/>
+                <w:lang w:val="en-US" w:eastAsia="zh-CN"/>
+              </w:rPr>
+              <w:t xml:space="preserve">on what to do in the project, to guide tool selection, or to delegate the project's structure, underlying theories, or final decisions. </w:t>
+            </w:r>
+            <w:r>
+              <w:rPr>
+                <w:rFonts w:hint="default" w:ascii="Arial" w:hAnsi="Arial" w:cs="Arial"/>
+                <w:sz w:val="22"/>
+                <w:szCs w:val="22"/>
+                <w:lang w:val="en-GB" w:eastAsia="zh-CN"/>
+              </w:rPr>
+              <w:t>T</w:t>
+            </w:r>
+            <w:r>
+              <w:rPr>
+                <w:rFonts w:hint="default" w:ascii="Arial" w:hAnsi="Arial" w:cs="Arial"/>
+                <w:sz w:val="22"/>
+                <w:szCs w:val="22"/>
+                <w:lang w:val="en-US" w:eastAsia="zh-CN"/>
+              </w:rPr>
+              <w:t xml:space="preserve">o avoid bias or relying </w:t>
+            </w:r>
+            <w:r>
+              <w:rPr>
+                <w:rFonts w:hint="default" w:ascii="Arial" w:hAnsi="Arial" w:cs="Arial"/>
+                <w:sz w:val="22"/>
+                <w:szCs w:val="22"/>
+                <w:lang w:val="en-GB" w:eastAsia="zh-CN"/>
+              </w:rPr>
+              <w:t xml:space="preserve">too much </w:t>
+            </w:r>
+            <w:r>
+              <w:rPr>
+                <w:rFonts w:hint="default" w:ascii="Arial" w:hAnsi="Arial" w:cs="Arial"/>
+                <w:sz w:val="22"/>
+                <w:szCs w:val="22"/>
+                <w:lang w:val="en-US" w:eastAsia="zh-CN"/>
+              </w:rPr>
+              <w:t xml:space="preserve">on the tool in highly technical areas where </w:t>
+            </w:r>
+            <w:r>
+              <w:rPr>
+                <w:rFonts w:hint="default" w:ascii="Arial" w:hAnsi="Arial" w:cs="Arial"/>
+                <w:sz w:val="22"/>
+                <w:szCs w:val="22"/>
+                <w:lang w:val="en-GB" w:eastAsia="zh-CN"/>
+              </w:rPr>
+              <w:t>I</w:t>
+            </w:r>
+            <w:r>
+              <w:rPr>
+                <w:rFonts w:hint="default" w:ascii="Arial" w:hAnsi="Arial" w:cs="Arial"/>
+                <w:sz w:val="22"/>
+                <w:szCs w:val="22"/>
+                <w:lang w:val="en-US" w:eastAsia="zh-CN"/>
+              </w:rPr>
+              <w:t xml:space="preserve"> </w:t>
+            </w:r>
+            <w:r>
+              <w:rPr>
+                <w:rFonts w:hint="default" w:ascii="Arial" w:hAnsi="Arial" w:cs="Arial"/>
+                <w:sz w:val="22"/>
+                <w:szCs w:val="22"/>
+                <w:lang w:val="en-GB" w:eastAsia="zh-CN"/>
+              </w:rPr>
+              <w:t xml:space="preserve">don’t </w:t>
+            </w:r>
+            <w:r>
+              <w:rPr>
+                <w:rFonts w:hint="default" w:ascii="Arial" w:hAnsi="Arial" w:cs="Arial"/>
+                <w:sz w:val="22"/>
+                <w:szCs w:val="22"/>
+                <w:lang w:val="en-US" w:eastAsia="zh-CN"/>
+              </w:rPr>
+              <w:t xml:space="preserve">have sufficient criteria to evaluate the relevance of the output. </w:t>
             </w:r>
           </w:p>
         </w:tc>
@@ -6893,41 +7292,40 @@
       <w:tr>
         <w:tblPrEx>
           <w:tblBorders>
-            <w:top w:val="none" w:color="auto" w:sz="0" w:space="0"/>
-            <w:left w:val="none" w:color="auto" w:sz="0" w:space="0"/>
-            <w:bottom w:val="none" w:color="auto" w:sz="0" w:space="0"/>
-            <w:right w:val="none" w:color="auto" w:sz="0" w:space="0"/>
+            <w:top w:val="none" w:color="1F1F1F" w:sz="0" w:space="0"/>
+            <w:left w:val="none" w:color="1F1F1F" w:sz="0" w:space="0"/>
+            <w:bottom w:val="none" w:color="1F1F1F" w:sz="0" w:space="0"/>
+            <w:right w:val="none" w:color="1F1F1F" w:sz="0" w:space="0"/>
             <w:insideH w:val="none" w:color="auto" w:sz="0" w:space="0"/>
             <w:insideV w:val="none" w:color="auto" w:sz="0" w:space="0"/>
           </w:tblBorders>
-          <w:shd w:val="clear" w:color="auto" w:fill="auto"/>
           <w:tblCellMar>
-            <w:top w:w="15" w:type="dxa"/>
-            <w:left w:w="15" w:type="dxa"/>
-            <w:bottom w:w="15" w:type="dxa"/>
-            <w:right w:w="15" w:type="dxa"/>
+            <w:top w:w="0" w:type="dxa"/>
+            <w:left w:w="0" w:type="dxa"/>
+            <w:bottom w:w="0" w:type="dxa"/>
+            <w:right w:w="0" w:type="dxa"/>
           </w:tblCellMar>
         </w:tblPrEx>
         <w:trPr>
-          <w:trHeight w:val="0" w:hRule="atLeast"/>
+          <w:tblCellSpacing w:w="15" w:type="dxa"/>
         </w:trPr>
         <w:tc>
           <w:tcPr>
-            <w:tcW w:w="0" w:type="auto"/>
+            <w:tcW w:w="2621" w:type="dxa"/>
             <w:tcBorders>
-              <w:top w:val="single" w:color="000000" w:sz="4" w:space="0"/>
-              <w:left w:val="single" w:color="000000" w:sz="4" w:space="0"/>
-              <w:bottom w:val="single" w:color="000000" w:sz="4" w:space="0"/>
-              <w:right w:val="single" w:color="000000" w:sz="4" w:space="0"/>
+              <w:top w:val="single" w:color="C4C7C5" w:sz="4" w:space="0"/>
+              <w:left w:val="single" w:color="C4C7C5" w:sz="4" w:space="0"/>
+              <w:bottom w:val="single" w:color="C4C7C5" w:sz="4" w:space="0"/>
+              <w:right w:val="single" w:color="C4C7C5" w:sz="4" w:space="0"/>
             </w:tcBorders>
-            <w:shd w:val="clear" w:color="auto" w:fill="auto"/>
+            <w:shd w:val="clear"/>
             <w:tcMar>
-              <w:top w:w="0" w:type="dxa"/>
-              <w:left w:w="108" w:type="dxa"/>
-              <w:bottom w:w="0" w:type="dxa"/>
-              <w:right w:w="108" w:type="dxa"/>
+              <w:top w:w="120" w:type="dxa"/>
+              <w:left w:w="180" w:type="dxa"/>
+              <w:bottom w:w="120" w:type="dxa"/>
+              <w:right w:w="180" w:type="dxa"/>
             </w:tcMar>
-            <w:vAlign w:val="top"/>
+            <w:vAlign w:val="center"/>
           </w:tcPr>
           <w:p>
             <w:pPr>
@@ -6945,48 +7343,92 @@
                 <w:rFonts w:hint="default" w:ascii="Arial" w:hAnsi="Arial" w:cs="Arial"/>
                 <w:sz w:val="22"/>
                 <w:szCs w:val="22"/>
+                <w:lang w:val="en-US" w:eastAsia="zh-CN"/>
               </w:rPr>
               <w:t>Description</w:t>
             </w:r>
-          </w:p>
-          <w:p>
-            <w:pPr>
-              <w:bidi w:val="0"/>
-              <w:spacing w:line="240" w:lineRule="auto"/>
-              <w:jc w:val="both"/>
-              <w:rPr>
-                <w:rFonts w:hint="default" w:ascii="Arial" w:hAnsi="Arial" w:cs="Arial"/>
-                <w:sz w:val="22"/>
-                <w:szCs w:val="22"/>
-              </w:rPr>
-            </w:pPr>
-            <w:r>
-              <w:rPr>
-                <w:rFonts w:hint="default" w:ascii="Arial" w:hAnsi="Arial" w:cs="Arial"/>
-                <w:sz w:val="22"/>
-                <w:szCs w:val="22"/>
+            <w:r>
+              <w:rPr>
+                <w:rFonts w:hint="default" w:ascii="Arial" w:hAnsi="Arial" w:cs="Arial"/>
+                <w:sz w:val="22"/>
+                <w:szCs w:val="22"/>
+                <w:lang w:val="en-GB" w:eastAsia="zh-CN"/>
+              </w:rPr>
+              <w:t>.</w:t>
+            </w:r>
+            <w:r>
+              <w:rPr>
+                <w:rFonts w:hint="default" w:ascii="Arial" w:hAnsi="Arial" w:cs="Arial"/>
+                <w:sz w:val="22"/>
+                <w:szCs w:val="22"/>
+                <w:lang w:val="en-US" w:eastAsia="zh-CN"/>
               </w:rPr>
               <w:t>How you prompted the AI</w:t>
             </w:r>
+          </w:p>
+          <w:p>
+            <w:pPr>
+              <w:bidi w:val="0"/>
+              <w:spacing w:line="240" w:lineRule="auto"/>
+              <w:jc w:val="both"/>
+              <w:rPr>
+                <w:rFonts w:hint="default" w:ascii="Arial" w:hAnsi="Arial" w:cs="Arial"/>
+                <w:sz w:val="22"/>
+                <w:szCs w:val="22"/>
+              </w:rPr>
+            </w:pPr>
+          </w:p>
+          <w:p>
+            <w:pPr>
+              <w:bidi w:val="0"/>
+              <w:spacing w:line="240" w:lineRule="auto"/>
+              <w:jc w:val="both"/>
+              <w:rPr>
+                <w:rFonts w:hint="default" w:ascii="Arial" w:hAnsi="Arial" w:cs="Arial"/>
+                <w:sz w:val="22"/>
+                <w:szCs w:val="22"/>
+              </w:rPr>
+            </w:pPr>
+            <w:r>
+              <w:rPr>
+                <w:rFonts w:hint="default" w:ascii="Arial" w:hAnsi="Arial" w:cs="Arial"/>
+                <w:sz w:val="22"/>
+                <w:szCs w:val="22"/>
+                <w:lang w:val="en-US" w:eastAsia="zh-CN"/>
+              </w:rPr>
+              <w:t>Include the exact prompts you used in your appendix (recorded on the AI Tools declaration). Reflect on how you communicated your goals to the AI — did you need to iterate or refine your prompts to get useful output?</w:t>
+            </w:r>
+          </w:p>
+          <w:p>
+            <w:pPr>
+              <w:bidi w:val="0"/>
+              <w:spacing w:line="240" w:lineRule="auto"/>
+              <w:jc w:val="both"/>
+              <w:rPr>
+                <w:rFonts w:hint="default" w:ascii="Arial" w:hAnsi="Arial" w:cs="Arial"/>
+                <w:sz w:val="22"/>
+                <w:szCs w:val="22"/>
+              </w:rPr>
+            </w:pPr>
           </w:p>
         </w:tc>
         <w:tc>
           <w:tcPr>
-            <w:tcW w:w="0" w:type="auto"/>
+            <w:tcW w:w="7357" w:type="dxa"/>
             <w:tcBorders>
-              <w:top w:val="single" w:color="000000" w:sz="4" w:space="0"/>
-              <w:left w:val="single" w:color="000000" w:sz="4" w:space="0"/>
-              <w:bottom w:val="single" w:color="000000" w:sz="4" w:space="0"/>
-              <w:right w:val="single" w:color="000000" w:sz="4" w:space="0"/>
+              <w:top w:val="single" w:color="C4C7C5" w:sz="4" w:space="0"/>
+              <w:left w:val="single" w:color="C4C7C5" w:sz="4" w:space="0"/>
+              <w:bottom w:val="single" w:color="C4C7C5" w:sz="4" w:space="0"/>
+              <w:right w:val="single" w:color="C4C7C5" w:sz="4" w:space="0"/>
             </w:tcBorders>
-            <w:shd w:val="clear" w:color="auto" w:fill="auto"/>
+            <w:shd w:val="clear"/>
             <w:tcMar>
-              <w:top w:w="0" w:type="dxa"/>
-              <w:left w:w="108" w:type="dxa"/>
-              <w:bottom w:w="0" w:type="dxa"/>
-              <w:right w:w="108" w:type="dxa"/>
+              <w:top w:w="120" w:type="dxa"/>
+              <w:left w:w="180" w:type="dxa"/>
+              <w:bottom w:w="120" w:type="dxa"/>
+              <w:right w:w="180" w:type="dxa"/>
             </w:tcMar>
-            <w:vAlign w:val="top"/>
+            <w:vAlign w:val="center"/>
           </w:tcPr>
           <w:p>
             <w:pPr>
@@ -7004,68 +7446,18 @@
                 <w:rFonts w:hint="default" w:ascii="Arial" w:hAnsi="Arial" w:cs="Arial"/>
                 <w:sz w:val="22"/>
                 <w:szCs w:val="22"/>
-              </w:rPr>
-              <w:t>Include the exact prompts you used in your appendix (recorded on the AI Tools declaration). Reflect on how you communicated your goals to the AI — did you need to iterate or refine your prompts to get useful output?</w:t>
-            </w:r>
-          </w:p>
-        </w:tc>
-        <w:tc>
-          <w:tcPr>
-            <w:tcW w:w="0" w:type="auto"/>
-            <w:tcBorders>
-              <w:top w:val="single" w:color="000000" w:sz="4" w:space="0"/>
-              <w:left w:val="single" w:color="000000" w:sz="4" w:space="0"/>
-              <w:bottom w:val="single" w:color="000000" w:sz="4" w:space="0"/>
-              <w:right w:val="single" w:color="000000" w:sz="4" w:space="0"/>
-            </w:tcBorders>
-            <w:shd w:val="clear" w:color="auto" w:fill="auto"/>
-            <w:tcMar>
-              <w:top w:w="0" w:type="dxa"/>
-              <w:left w:w="108" w:type="dxa"/>
-              <w:bottom w:w="0" w:type="dxa"/>
-              <w:right w:w="108" w:type="dxa"/>
-            </w:tcMar>
-            <w:vAlign w:val="top"/>
-          </w:tcPr>
-          <w:p>
-            <w:pPr>
-              <w:bidi w:val="0"/>
-              <w:spacing w:line="240" w:lineRule="auto"/>
-              <w:jc w:val="both"/>
-              <w:rPr>
-                <w:rFonts w:hint="default" w:ascii="Arial" w:hAnsi="Arial" w:cs="Arial"/>
-                <w:sz w:val="22"/>
-                <w:szCs w:val="22"/>
-              </w:rPr>
-            </w:pPr>
-            <w:r>
-              <w:rPr>
-                <w:rFonts w:hint="default" w:ascii="Arial" w:hAnsi="Arial" w:cs="Arial"/>
-                <w:sz w:val="22"/>
-                <w:szCs w:val="22"/>
-              </w:rPr>
-              <w:t>You must provide the exact prompts and relevant AI outputs used during the development of your application.</w:t>
-            </w:r>
-          </w:p>
-          <w:p>
-            <w:pPr>
-              <w:bidi w:val="0"/>
-              <w:spacing w:line="240" w:lineRule="auto"/>
-              <w:jc w:val="both"/>
-              <w:rPr>
-                <w:rFonts w:hint="default" w:ascii="Arial" w:hAnsi="Arial" w:cs="Arial"/>
-                <w:sz w:val="22"/>
-                <w:szCs w:val="22"/>
-              </w:rPr>
-            </w:pPr>
-            <w:r>
-              <w:rPr>
-                <w:rFonts w:hint="default" w:ascii="Arial" w:hAnsi="Arial" w:cs="Arial"/>
-                <w:sz w:val="22"/>
-                <w:szCs w:val="22"/>
                 <w:lang w:val="en-US" w:eastAsia="zh-CN"/>
               </w:rPr>
-              <w:br w:type="textWrapping"/>
+              <w:t>Specific</w:t>
+            </w:r>
+            <w:r>
+              <w:rPr>
+                <w:rFonts w:hint="default" w:ascii="Arial" w:hAnsi="Arial" w:cs="Arial"/>
+                <w:sz w:val="22"/>
+                <w:szCs w:val="22"/>
+                <w:lang w:val="en-GB" w:eastAsia="zh-CN"/>
+              </w:rPr>
+              <w:t xml:space="preserve"> tipes of</w:t>
             </w:r>
             <w:r>
               <w:rPr>
@@ -7074,46 +7466,7 @@
                 <w:szCs w:val="22"/>
                 <w:lang w:val="en-US" w:eastAsia="zh-CN"/>
               </w:rPr>
-              <w:br w:type="textWrapping"/>
-            </w:r>
-          </w:p>
-        </w:tc>
-        <w:tc>
-          <w:tcPr>
-            <w:tcW w:w="0" w:type="auto"/>
-            <w:tcBorders>
-              <w:top w:val="single" w:color="000000" w:sz="4" w:space="0"/>
-              <w:left w:val="single" w:color="000000" w:sz="4" w:space="0"/>
-              <w:bottom w:val="single" w:color="000000" w:sz="4" w:space="0"/>
-              <w:right w:val="single" w:color="000000" w:sz="4" w:space="0"/>
-            </w:tcBorders>
-            <w:shd w:val="clear" w:color="auto" w:fill="auto"/>
-            <w:tcMar>
-              <w:top w:w="0" w:type="dxa"/>
-              <w:left w:w="108" w:type="dxa"/>
-              <w:bottom w:w="0" w:type="dxa"/>
-              <w:right w:w="108" w:type="dxa"/>
-            </w:tcMar>
-            <w:vAlign w:val="top"/>
-          </w:tcPr>
-          <w:p>
-            <w:pPr>
-              <w:bidi w:val="0"/>
-              <w:spacing w:line="240" w:lineRule="auto"/>
-              <w:jc w:val="both"/>
-              <w:rPr>
-                <w:rFonts w:hint="default" w:ascii="Arial" w:hAnsi="Arial" w:cs="Arial"/>
-                <w:sz w:val="22"/>
-                <w:szCs w:val="22"/>
-              </w:rPr>
-            </w:pPr>
-            <w:r>
-              <w:rPr>
-                <w:rFonts w:hint="default" w:ascii="Arial" w:hAnsi="Arial" w:cs="Arial"/>
-                <w:sz w:val="22"/>
-                <w:szCs w:val="22"/>
-              </w:rPr>
-              <w:t>Include the exact AI prompts and outputs in your submitted AI-use Word document.</w:t>
+              <w:t xml:space="preserve"> prompts used:</w:t>
             </w:r>
           </w:p>
           <w:p>
@@ -7134,49 +7487,175 @@
                 <w:szCs w:val="22"/>
                 <w:lang w:val="en-US" w:eastAsia="zh-CN"/>
               </w:rPr>
-              <w:br w:type="textWrapping"/>
-            </w:r>
+              <w:t xml:space="preserve">"Below I will give you a text, transcribe it and translate it into English" (used multiple times). </w:t>
+            </w:r>
+          </w:p>
+          <w:p>
+            <w:pPr>
+              <w:bidi w:val="0"/>
+              <w:spacing w:line="240" w:lineRule="auto"/>
+              <w:jc w:val="both"/>
+              <w:rPr>
+                <w:rFonts w:hint="default" w:ascii="Arial" w:hAnsi="Arial" w:cs="Arial"/>
+                <w:sz w:val="22"/>
+                <w:szCs w:val="22"/>
+              </w:rPr>
+            </w:pPr>
+            <w:r>
+              <w:rPr>
+                <w:rFonts w:hint="default" w:ascii="Arial" w:hAnsi="Arial" w:cs="Arial"/>
+                <w:sz w:val="22"/>
+                <w:szCs w:val="22"/>
+                <w:lang w:val="en-US" w:eastAsia="zh-CN"/>
+              </w:rPr>
+              <w:t xml:space="preserve"> "Below I provide a list of databases I want to use, generate a table with their names, number of sources used, and relevant elements". </w:t>
+            </w:r>
+          </w:p>
+          <w:p>
+            <w:pPr>
+              <w:bidi w:val="0"/>
+              <w:spacing w:line="240" w:lineRule="auto"/>
+              <w:jc w:val="both"/>
+              <w:rPr>
+                <w:rFonts w:hint="default" w:ascii="Arial" w:hAnsi="Arial" w:cs="Arial"/>
+                <w:sz w:val="22"/>
+                <w:szCs w:val="22"/>
+              </w:rPr>
+            </w:pPr>
+            <w:r>
+              <w:rPr>
+                <w:rFonts w:hint="default" w:ascii="Arial" w:hAnsi="Arial" w:cs="Arial"/>
+                <w:sz w:val="22"/>
+                <w:szCs w:val="22"/>
+                <w:lang w:val="en-US" w:eastAsia="zh-CN"/>
+              </w:rPr>
+              <w:t xml:space="preserve">Editing prompts: "Eliminate spelling errors", "Translate into English", "Change format from APA to Harvard". </w:t>
+            </w:r>
+          </w:p>
+          <w:p>
+            <w:pPr>
+              <w:bidi w:val="0"/>
+              <w:spacing w:line="240" w:lineRule="auto"/>
+              <w:jc w:val="both"/>
+              <w:rPr>
+                <w:rFonts w:hint="default" w:ascii="Arial" w:hAnsi="Arial" w:cs="Arial"/>
+                <w:sz w:val="22"/>
+                <w:szCs w:val="22"/>
+              </w:rPr>
+            </w:pPr>
+          </w:p>
+          <w:p>
+            <w:pPr>
+              <w:bidi w:val="0"/>
+              <w:spacing w:line="240" w:lineRule="auto"/>
+              <w:jc w:val="both"/>
+              <w:rPr>
+                <w:rFonts w:hint="default" w:ascii="Arial" w:hAnsi="Arial" w:cs="Arial"/>
+                <w:sz w:val="22"/>
+                <w:szCs w:val="22"/>
+              </w:rPr>
+            </w:pPr>
+            <w:r>
+              <w:rPr>
+                <w:rFonts w:hint="default" w:ascii="Arial" w:hAnsi="Arial" w:cs="Arial"/>
+                <w:sz w:val="22"/>
+                <w:szCs w:val="22"/>
+                <w:lang w:val="en-US" w:eastAsia="zh-CN"/>
+              </w:rPr>
+              <w:t>Iteration and refinement:</w:t>
+            </w:r>
+          </w:p>
+          <w:p>
+            <w:pPr>
+              <w:bidi w:val="0"/>
+              <w:spacing w:line="240" w:lineRule="auto"/>
+              <w:jc w:val="both"/>
+              <w:rPr>
+                <w:rFonts w:hint="default" w:ascii="Arial" w:hAnsi="Arial" w:cs="Arial"/>
+                <w:sz w:val="22"/>
+                <w:szCs w:val="22"/>
+              </w:rPr>
+            </w:pPr>
+            <w:r>
+              <w:rPr>
+                <w:rFonts w:hint="default" w:ascii="Arial" w:hAnsi="Arial" w:cs="Arial"/>
+                <w:sz w:val="22"/>
+                <w:szCs w:val="22"/>
+                <w:lang w:val="en-US" w:eastAsia="zh-CN"/>
+              </w:rPr>
+              <w:t xml:space="preserve">It was necessary to iterate constantly  by communicating goals in the </w:t>
+            </w:r>
+            <w:r>
+              <w:rPr>
+                <w:rFonts w:hint="default" w:ascii="Arial" w:hAnsi="Arial" w:cs="Arial"/>
+                <w:sz w:val="22"/>
+                <w:szCs w:val="22"/>
+                <w:lang w:val="en-GB" w:eastAsia="zh-CN"/>
+              </w:rPr>
+              <w:t xml:space="preserve">my </w:t>
+            </w:r>
+            <w:r>
+              <w:rPr>
+                <w:rFonts w:hint="default" w:ascii="Arial" w:hAnsi="Arial" w:cs="Arial"/>
+                <w:sz w:val="22"/>
+                <w:szCs w:val="22"/>
+                <w:lang w:val="en-US" w:eastAsia="zh-CN"/>
+              </w:rPr>
+              <w:t xml:space="preserve">own words. For the database synthesis, subsequent prompts were used to refine the table, synthesize information, and make comparisons. For the objectives, prompts were progressively refined using requests such as: "Generate three objective options that integrate objective 1 and 4" or "Keep these two options out of those three", iteratively selecting the most relevant option. </w:t>
+            </w:r>
+          </w:p>
+          <w:p>
+            <w:pPr>
+              <w:bidi w:val="0"/>
+              <w:spacing w:line="240" w:lineRule="auto"/>
+              <w:jc w:val="both"/>
+              <w:rPr>
+                <w:rFonts w:hint="default" w:ascii="Arial" w:hAnsi="Arial" w:cs="Arial"/>
+                <w:sz w:val="22"/>
+                <w:szCs w:val="22"/>
+              </w:rPr>
+            </w:pPr>
           </w:p>
         </w:tc>
       </w:tr>
       <w:tr>
         <w:tblPrEx>
           <w:tblBorders>
-            <w:top w:val="none" w:color="auto" w:sz="0" w:space="0"/>
-            <w:left w:val="none" w:color="auto" w:sz="0" w:space="0"/>
-            <w:bottom w:val="none" w:color="auto" w:sz="0" w:space="0"/>
-            <w:right w:val="none" w:color="auto" w:sz="0" w:space="0"/>
+            <w:top w:val="none" w:color="1F1F1F" w:sz="0" w:space="0"/>
+            <w:left w:val="none" w:color="1F1F1F" w:sz="0" w:space="0"/>
+            <w:bottom w:val="none" w:color="1F1F1F" w:sz="0" w:space="0"/>
+            <w:right w:val="none" w:color="1F1F1F" w:sz="0" w:space="0"/>
             <w:insideH w:val="none" w:color="auto" w:sz="0" w:space="0"/>
             <w:insideV w:val="none" w:color="auto" w:sz="0" w:space="0"/>
           </w:tblBorders>
-          <w:shd w:val="clear" w:color="auto" w:fill="auto"/>
+          <w:shd w:val="clear"/>
           <w:tblCellMar>
-            <w:top w:w="15" w:type="dxa"/>
-            <w:left w:w="15" w:type="dxa"/>
-            <w:bottom w:w="15" w:type="dxa"/>
-            <w:right w:w="15" w:type="dxa"/>
+            <w:top w:w="0" w:type="dxa"/>
+            <w:left w:w="0" w:type="dxa"/>
+            <w:bottom w:w="0" w:type="dxa"/>
+            <w:right w:w="0" w:type="dxa"/>
           </w:tblCellMar>
         </w:tblPrEx>
         <w:trPr>
-          <w:trHeight w:val="0" w:hRule="atLeast"/>
+          <w:tblCellSpacing w:w="15" w:type="dxa"/>
         </w:trPr>
         <w:tc>
           <w:tcPr>
-            <w:tcW w:w="0" w:type="auto"/>
+            <w:tcW w:w="2621" w:type="dxa"/>
             <w:tcBorders>
-              <w:top w:val="single" w:color="000000" w:sz="4" w:space="0"/>
-              <w:left w:val="single" w:color="000000" w:sz="4" w:space="0"/>
-              <w:bottom w:val="single" w:color="000000" w:sz="4" w:space="0"/>
-              <w:right w:val="single" w:color="000000" w:sz="4" w:space="0"/>
+              <w:top w:val="single" w:color="C4C7C5" w:sz="4" w:space="0"/>
+              <w:left w:val="single" w:color="C4C7C5" w:sz="4" w:space="0"/>
+              <w:bottom w:val="single" w:color="C4C7C5" w:sz="4" w:space="0"/>
+              <w:right w:val="single" w:color="C4C7C5" w:sz="4" w:space="0"/>
             </w:tcBorders>
-            <w:shd w:val="clear" w:color="auto" w:fill="auto"/>
+            <w:shd w:val="clear"/>
             <w:tcMar>
-              <w:top w:w="0" w:type="dxa"/>
-              <w:left w:w="108" w:type="dxa"/>
-              <w:bottom w:w="0" w:type="dxa"/>
-              <w:right w:w="108" w:type="dxa"/>
+              <w:top w:w="120" w:type="dxa"/>
+              <w:left w:w="180" w:type="dxa"/>
+              <w:bottom w:w="120" w:type="dxa"/>
+              <w:right w:w="180" w:type="dxa"/>
             </w:tcMar>
-            <w:vAlign w:val="top"/>
+            <w:vAlign w:val="center"/>
           </w:tcPr>
           <w:p>
             <w:pPr>
@@ -7194,48 +7673,92 @@
                 <w:rFonts w:hint="default" w:ascii="Arial" w:hAnsi="Arial" w:cs="Arial"/>
                 <w:sz w:val="22"/>
                 <w:szCs w:val="22"/>
+                <w:lang w:val="en-US" w:eastAsia="zh-CN"/>
               </w:rPr>
               <w:t>Discernment</w:t>
             </w:r>
-          </w:p>
-          <w:p>
-            <w:pPr>
-              <w:bidi w:val="0"/>
-              <w:spacing w:line="240" w:lineRule="auto"/>
-              <w:jc w:val="both"/>
-              <w:rPr>
-                <w:rFonts w:hint="default" w:ascii="Arial" w:hAnsi="Arial" w:cs="Arial"/>
-                <w:sz w:val="22"/>
-                <w:szCs w:val="22"/>
-              </w:rPr>
-            </w:pPr>
-            <w:r>
-              <w:rPr>
-                <w:rFonts w:hint="default" w:ascii="Arial" w:hAnsi="Arial" w:cs="Arial"/>
-                <w:sz w:val="22"/>
-                <w:szCs w:val="22"/>
+            <w:r>
+              <w:rPr>
+                <w:rFonts w:hint="default" w:ascii="Arial" w:hAnsi="Arial" w:cs="Arial"/>
+                <w:sz w:val="22"/>
+                <w:szCs w:val="22"/>
+                <w:lang w:val="en-GB" w:eastAsia="zh-CN"/>
+              </w:rPr>
+              <w:t>.</w:t>
+            </w:r>
+            <w:r>
+              <w:rPr>
+                <w:rFonts w:hint="default" w:ascii="Arial" w:hAnsi="Arial" w:cs="Arial"/>
+                <w:sz w:val="22"/>
+                <w:szCs w:val="22"/>
+                <w:lang w:val="en-US" w:eastAsia="zh-CN"/>
               </w:rPr>
               <w:t>Evaluating what the AI produced</w:t>
             </w:r>
+          </w:p>
+          <w:p>
+            <w:pPr>
+              <w:bidi w:val="0"/>
+              <w:spacing w:line="240" w:lineRule="auto"/>
+              <w:jc w:val="both"/>
+              <w:rPr>
+                <w:rFonts w:hint="default" w:ascii="Arial" w:hAnsi="Arial" w:cs="Arial"/>
+                <w:sz w:val="22"/>
+                <w:szCs w:val="22"/>
+              </w:rPr>
+            </w:pPr>
+          </w:p>
+          <w:p>
+            <w:pPr>
+              <w:bidi w:val="0"/>
+              <w:spacing w:line="240" w:lineRule="auto"/>
+              <w:jc w:val="both"/>
+              <w:rPr>
+                <w:rFonts w:hint="default" w:ascii="Arial" w:hAnsi="Arial" w:cs="Arial"/>
+                <w:sz w:val="22"/>
+                <w:szCs w:val="22"/>
+              </w:rPr>
+            </w:pPr>
+            <w:r>
+              <w:rPr>
+                <w:rFonts w:hint="default" w:ascii="Arial" w:hAnsi="Arial" w:cs="Arial"/>
+                <w:sz w:val="22"/>
+                <w:szCs w:val="22"/>
+                <w:lang w:val="en-US" w:eastAsia="zh-CN"/>
+              </w:rPr>
+              <w:t>In your reflection, critically evaluate the AI output: what did you accept, modify, or reject — and why? Assess accuracy, relevance, and quality. You are responsible for verifying all AI-generated content before submitting.</w:t>
+            </w:r>
+          </w:p>
+          <w:p>
+            <w:pPr>
+              <w:bidi w:val="0"/>
+              <w:spacing w:line="240" w:lineRule="auto"/>
+              <w:jc w:val="both"/>
+              <w:rPr>
+                <w:rFonts w:hint="default" w:ascii="Arial" w:hAnsi="Arial" w:cs="Arial"/>
+                <w:sz w:val="22"/>
+                <w:szCs w:val="22"/>
+              </w:rPr>
+            </w:pPr>
           </w:p>
         </w:tc>
         <w:tc>
           <w:tcPr>
-            <w:tcW w:w="0" w:type="auto"/>
+            <w:tcW w:w="7357" w:type="dxa"/>
             <w:tcBorders>
-              <w:top w:val="single" w:color="000000" w:sz="4" w:space="0"/>
-              <w:left w:val="single" w:color="000000" w:sz="4" w:space="0"/>
-              <w:bottom w:val="single" w:color="000000" w:sz="4" w:space="0"/>
-              <w:right w:val="single" w:color="000000" w:sz="4" w:space="0"/>
+              <w:top w:val="single" w:color="C4C7C5" w:sz="4" w:space="0"/>
+              <w:left w:val="single" w:color="C4C7C5" w:sz="4" w:space="0"/>
+              <w:bottom w:val="single" w:color="C4C7C5" w:sz="4" w:space="0"/>
+              <w:right w:val="single" w:color="C4C7C5" w:sz="4" w:space="0"/>
             </w:tcBorders>
-            <w:shd w:val="clear" w:color="auto" w:fill="auto"/>
+            <w:shd w:val="clear"/>
             <w:tcMar>
-              <w:top w:w="0" w:type="dxa"/>
-              <w:left w:w="108" w:type="dxa"/>
-              <w:bottom w:w="0" w:type="dxa"/>
-              <w:right w:w="108" w:type="dxa"/>
+              <w:top w:w="120" w:type="dxa"/>
+              <w:left w:w="180" w:type="dxa"/>
+              <w:bottom w:w="120" w:type="dxa"/>
+              <w:right w:w="180" w:type="dxa"/>
             </w:tcMar>
-            <w:vAlign w:val="top"/>
+            <w:vAlign w:val="center"/>
           </w:tcPr>
           <w:p>
             <w:pPr>
@@ -7253,144 +7776,22 @@
                 <w:rFonts w:hint="default" w:ascii="Arial" w:hAnsi="Arial" w:cs="Arial"/>
                 <w:sz w:val="22"/>
                 <w:szCs w:val="22"/>
-              </w:rPr>
-              <w:t>In your reflection, critically evaluate the AI output: what did you accept, modify, or reject — and why? Assess accuracy, relevance, and quality. You are responsible for verifying all AI-generated content before submitting.</w:t>
-            </w:r>
-          </w:p>
-        </w:tc>
-        <w:tc>
-          <w:tcPr>
-            <w:tcW w:w="0" w:type="auto"/>
-            <w:tcBorders>
-              <w:top w:val="single" w:color="000000" w:sz="4" w:space="0"/>
-              <w:left w:val="single" w:color="000000" w:sz="4" w:space="0"/>
-              <w:bottom w:val="single" w:color="000000" w:sz="4" w:space="0"/>
-              <w:right w:val="single" w:color="000000" w:sz="4" w:space="0"/>
-            </w:tcBorders>
-            <w:shd w:val="clear" w:color="auto" w:fill="auto"/>
-            <w:tcMar>
-              <w:top w:w="0" w:type="dxa"/>
-              <w:left w:w="108" w:type="dxa"/>
-              <w:bottom w:w="0" w:type="dxa"/>
-              <w:right w:w="108" w:type="dxa"/>
-            </w:tcMar>
-            <w:vAlign w:val="top"/>
-          </w:tcPr>
-          <w:p>
-            <w:pPr>
-              <w:bidi w:val="0"/>
-              <w:spacing w:line="240" w:lineRule="auto"/>
-              <w:jc w:val="both"/>
-              <w:rPr>
-                <w:rFonts w:hint="default" w:ascii="Arial" w:hAnsi="Arial" w:cs="Arial"/>
-                <w:sz w:val="22"/>
-                <w:szCs w:val="22"/>
-              </w:rPr>
-            </w:pPr>
-          </w:p>
-          <w:p>
-            <w:pPr>
-              <w:bidi w:val="0"/>
-              <w:spacing w:line="240" w:lineRule="auto"/>
-              <w:jc w:val="both"/>
-              <w:rPr>
-                <w:rFonts w:hint="default" w:ascii="Arial" w:hAnsi="Arial" w:cs="Arial"/>
-                <w:sz w:val="22"/>
-                <w:szCs w:val="22"/>
-              </w:rPr>
-            </w:pPr>
-            <w:r>
-              <w:rPr>
-                <w:rFonts w:hint="default" w:ascii="Arial" w:hAnsi="Arial" w:cs="Arial"/>
-                <w:sz w:val="22"/>
-                <w:szCs w:val="22"/>
-              </w:rPr>
-              <w:t>You are responsible for checking, testing and understanding any AI-generated code or suggestions before using them in your work.</w:t>
-            </w:r>
-          </w:p>
-          <w:p>
-            <w:pPr>
-              <w:bidi w:val="0"/>
-              <w:spacing w:line="240" w:lineRule="auto"/>
-              <w:jc w:val="both"/>
-              <w:rPr>
-                <w:rFonts w:hint="default" w:ascii="Arial" w:hAnsi="Arial" w:cs="Arial"/>
-                <w:sz w:val="22"/>
-                <w:szCs w:val="22"/>
-              </w:rPr>
-            </w:pPr>
-          </w:p>
-        </w:tc>
-        <w:tc>
-          <w:tcPr>
-            <w:tcW w:w="0" w:type="auto"/>
-            <w:tcBorders>
-              <w:top w:val="single" w:color="000000" w:sz="4" w:space="0"/>
-              <w:left w:val="single" w:color="000000" w:sz="4" w:space="0"/>
-              <w:bottom w:val="single" w:color="000000" w:sz="4" w:space="0"/>
-              <w:right w:val="single" w:color="000000" w:sz="4" w:space="0"/>
-            </w:tcBorders>
-            <w:shd w:val="clear" w:color="auto" w:fill="auto"/>
-            <w:tcMar>
-              <w:top w:w="0" w:type="dxa"/>
-              <w:left w:w="108" w:type="dxa"/>
-              <w:bottom w:w="0" w:type="dxa"/>
-              <w:right w:w="108" w:type="dxa"/>
-            </w:tcMar>
-            <w:vAlign w:val="top"/>
-          </w:tcPr>
-          <w:p>
-            <w:pPr>
-              <w:bidi w:val="0"/>
-              <w:spacing w:line="240" w:lineRule="auto"/>
-              <w:jc w:val="both"/>
-              <w:rPr>
-                <w:rFonts w:hint="default" w:ascii="Arial" w:hAnsi="Arial" w:cs="Arial"/>
-                <w:sz w:val="22"/>
-                <w:szCs w:val="22"/>
-              </w:rPr>
-            </w:pPr>
-          </w:p>
-          <w:p>
-            <w:pPr>
-              <w:bidi w:val="0"/>
-              <w:spacing w:line="240" w:lineRule="auto"/>
-              <w:jc w:val="both"/>
-              <w:rPr>
-                <w:rFonts w:hint="default" w:ascii="Arial" w:hAnsi="Arial" w:cs="Arial"/>
-                <w:sz w:val="22"/>
-                <w:szCs w:val="22"/>
-              </w:rPr>
-            </w:pPr>
-            <w:r>
-              <w:rPr>
-                <w:rFonts w:hint="default" w:ascii="Arial" w:hAnsi="Arial" w:cs="Arial"/>
-                <w:sz w:val="22"/>
-                <w:szCs w:val="22"/>
-              </w:rPr>
-              <w:t>Briefly explain how you verified the AI output and what you accepted, modified or rejected.</w:t>
-            </w:r>
-          </w:p>
-          <w:p>
-            <w:pPr>
-              <w:bidi w:val="0"/>
-              <w:spacing w:line="240" w:lineRule="auto"/>
-              <w:jc w:val="both"/>
-              <w:rPr>
-                <w:rFonts w:hint="default" w:ascii="Arial" w:hAnsi="Arial" w:cs="Arial"/>
-                <w:sz w:val="22"/>
-                <w:szCs w:val="22"/>
-              </w:rPr>
-            </w:pPr>
-            <w:r>
-              <w:rPr>
-                <w:rFonts w:hint="default" w:ascii="Arial" w:hAnsi="Arial" w:cs="Arial"/>
-                <w:sz w:val="22"/>
-                <w:szCs w:val="22"/>
                 <w:lang w:val="en-US" w:eastAsia="zh-CN"/>
               </w:rPr>
-              <w:br w:type="textWrapping"/>
-            </w:r>
+              <w:t>Critical evaluation of content:</w:t>
+            </w:r>
+          </w:p>
+          <w:p>
+            <w:pPr>
+              <w:bidi w:val="0"/>
+              <w:spacing w:line="240" w:lineRule="auto"/>
+              <w:jc w:val="both"/>
+              <w:rPr>
+                <w:rFonts w:hint="default" w:ascii="Arial" w:hAnsi="Arial" w:cs="Arial"/>
+                <w:sz w:val="22"/>
+                <w:szCs w:val="22"/>
+              </w:rPr>
+            </w:pPr>
             <w:r>
               <w:rPr>
                 <w:rFonts w:hint="default" w:ascii="Arial" w:hAnsi="Arial" w:cs="Arial"/>
@@ -7398,49 +7799,177 @@
                 <w:szCs w:val="22"/>
                 <w:lang w:val="en-US" w:eastAsia="zh-CN"/>
               </w:rPr>
-              <w:br w:type="textWrapping"/>
-            </w:r>
+              <w:t xml:space="preserve">The overall quality of translation and drafting was very good and significantly better than what the </w:t>
+            </w:r>
+            <w:r>
+              <w:rPr>
+                <w:rFonts w:hint="default" w:ascii="Arial" w:hAnsi="Arial" w:cs="Arial"/>
+                <w:sz w:val="22"/>
+                <w:szCs w:val="22"/>
+                <w:lang w:val="en-GB" w:eastAsia="zh-CN"/>
+              </w:rPr>
+              <w:t xml:space="preserve">I </w:t>
+            </w:r>
+            <w:r>
+              <w:rPr>
+                <w:rFonts w:hint="default" w:ascii="Arial" w:hAnsi="Arial" w:cs="Arial"/>
+                <w:sz w:val="22"/>
+                <w:szCs w:val="22"/>
+                <w:lang w:val="en-US" w:eastAsia="zh-CN"/>
+              </w:rPr>
+              <w:t>could achieve individually. All outputs required some degree of refinement</w:t>
+            </w:r>
+            <w:r>
+              <w:rPr>
+                <w:rFonts w:hint="default" w:ascii="Arial" w:hAnsi="Arial" w:cs="Arial"/>
+                <w:sz w:val="22"/>
+                <w:szCs w:val="22"/>
+                <w:lang w:val="en-GB" w:eastAsia="zh-CN"/>
+              </w:rPr>
+              <w:t>, fore example, t</w:t>
+            </w:r>
+            <w:r>
+              <w:rPr>
+                <w:rFonts w:hint="default" w:ascii="Arial" w:hAnsi="Arial" w:cs="Arial"/>
+                <w:sz w:val="22"/>
+                <w:szCs w:val="22"/>
+                <w:lang w:val="en-US" w:eastAsia="zh-CN"/>
+              </w:rPr>
+              <w:t xml:space="preserve">he AI consistently shifted probabilistic or optional statements into absolute certainty (e.g., changing "one possibility would be to use certain steps" to "the steps to be used will be..."), requiring manual and prompt-based corrections. </w:t>
+            </w:r>
+            <w:r>
+              <w:rPr>
+                <w:rFonts w:hint="default" w:ascii="Arial" w:hAnsi="Arial" w:cs="Arial"/>
+                <w:sz w:val="22"/>
+                <w:szCs w:val="22"/>
+                <w:lang w:val="en-GB"/>
+              </w:rPr>
+              <w:t>A</w:t>
+            </w:r>
+            <w:r>
+              <w:rPr>
+                <w:rFonts w:hint="default" w:ascii="Arial" w:hAnsi="Arial" w:cs="Arial"/>
+                <w:sz w:val="22"/>
+                <w:szCs w:val="22"/>
+                <w:lang w:val="en-GB"/>
+              </w:rPr>
+              <w:t>lso,</w:t>
+            </w:r>
+            <w:r>
+              <w:rPr>
+                <w:rFonts w:hint="default" w:ascii="Arial" w:hAnsi="Arial" w:cs="Arial"/>
+                <w:sz w:val="22"/>
+                <w:szCs w:val="22"/>
+                <w:lang w:val="en-US" w:eastAsia="zh-CN"/>
+              </w:rPr>
+              <w:t xml:space="preserve"> </w:t>
+            </w:r>
+            <w:r>
+              <w:rPr>
+                <w:rFonts w:hint="default" w:ascii="Arial" w:hAnsi="Arial" w:cs="Arial"/>
+                <w:sz w:val="22"/>
+                <w:szCs w:val="22"/>
+                <w:lang w:val="en-GB" w:eastAsia="zh-CN"/>
+              </w:rPr>
+              <w:t>w</w:t>
+            </w:r>
+            <w:bookmarkStart w:id="0" w:name="_GoBack"/>
+            <w:bookmarkEnd w:id="0"/>
+            <w:r>
+              <w:rPr>
+                <w:rFonts w:hint="default" w:ascii="Arial" w:hAnsi="Arial" w:cs="Arial"/>
+                <w:sz w:val="22"/>
+                <w:szCs w:val="22"/>
+                <w:lang w:val="en-US" w:eastAsia="zh-CN"/>
+              </w:rPr>
+              <w:t xml:space="preserve">hile the names and information were accurate, links sometimes directed to general homepages rather than specific pages, needing manual fixes. </w:t>
+            </w:r>
+          </w:p>
+          <w:p>
+            <w:pPr>
+              <w:bidi w:val="0"/>
+              <w:spacing w:line="240" w:lineRule="auto"/>
+              <w:jc w:val="both"/>
+              <w:rPr>
+                <w:rFonts w:hint="default" w:ascii="Arial" w:hAnsi="Arial" w:cs="Arial"/>
+                <w:sz w:val="22"/>
+                <w:szCs w:val="22"/>
+              </w:rPr>
+            </w:pPr>
+          </w:p>
+          <w:p>
+            <w:pPr>
+              <w:bidi w:val="0"/>
+              <w:spacing w:line="240" w:lineRule="auto"/>
+              <w:jc w:val="both"/>
+              <w:rPr>
+                <w:rFonts w:hint="default" w:ascii="Arial" w:hAnsi="Arial" w:cs="Arial"/>
+                <w:sz w:val="22"/>
+                <w:szCs w:val="22"/>
+              </w:rPr>
+            </w:pPr>
+            <w:r>
+              <w:rPr>
+                <w:rFonts w:hint="default" w:ascii="Arial" w:hAnsi="Arial" w:cs="Arial"/>
+                <w:sz w:val="22"/>
+                <w:szCs w:val="22"/>
+                <w:lang w:val="en-US" w:eastAsia="zh-CN"/>
+              </w:rPr>
+              <w:t xml:space="preserve">• Rejected: The AI performed significantly poorly when attempting to merge, structure, or expand objectives, as it added multiple verbs or turned objectives into step-by-step lists, worsening the original input. </w:t>
+            </w:r>
+          </w:p>
+          <w:p>
+            <w:pPr>
+              <w:bidi w:val="0"/>
+              <w:spacing w:line="240" w:lineRule="auto"/>
+              <w:jc w:val="both"/>
+              <w:rPr>
+                <w:rFonts w:hint="default" w:ascii="Arial" w:hAnsi="Arial" w:cs="Arial"/>
+                <w:sz w:val="22"/>
+                <w:szCs w:val="22"/>
+              </w:rPr>
+            </w:pPr>
           </w:p>
         </w:tc>
       </w:tr>
       <w:tr>
         <w:tblPrEx>
           <w:tblBorders>
-            <w:top w:val="none" w:color="auto" w:sz="0" w:space="0"/>
-            <w:left w:val="none" w:color="auto" w:sz="0" w:space="0"/>
-            <w:bottom w:val="none" w:color="auto" w:sz="0" w:space="0"/>
-            <w:right w:val="none" w:color="auto" w:sz="0" w:space="0"/>
+            <w:top w:val="none" w:color="1F1F1F" w:sz="0" w:space="0"/>
+            <w:left w:val="none" w:color="1F1F1F" w:sz="0" w:space="0"/>
+            <w:bottom w:val="none" w:color="1F1F1F" w:sz="0" w:space="0"/>
+            <w:right w:val="none" w:color="1F1F1F" w:sz="0" w:space="0"/>
             <w:insideH w:val="none" w:color="auto" w:sz="0" w:space="0"/>
             <w:insideV w:val="none" w:color="auto" w:sz="0" w:space="0"/>
           </w:tblBorders>
-          <w:shd w:val="clear" w:color="auto" w:fill="auto"/>
+          <w:shd w:val="clear"/>
           <w:tblCellMar>
-            <w:top w:w="15" w:type="dxa"/>
-            <w:left w:w="15" w:type="dxa"/>
-            <w:bottom w:w="15" w:type="dxa"/>
-            <w:right w:w="15" w:type="dxa"/>
+            <w:top w:w="0" w:type="dxa"/>
+            <w:left w:w="0" w:type="dxa"/>
+            <w:bottom w:w="0" w:type="dxa"/>
+            <w:right w:w="0" w:type="dxa"/>
           </w:tblCellMar>
         </w:tblPrEx>
         <w:trPr>
-          <w:trHeight w:val="3034" w:hRule="atLeast"/>
+          <w:tblCellSpacing w:w="15" w:type="dxa"/>
         </w:trPr>
         <w:tc>
           <w:tcPr>
-            <w:tcW w:w="0" w:type="auto"/>
+            <w:tcW w:w="2621" w:type="dxa"/>
             <w:tcBorders>
-              <w:top w:val="single" w:color="000000" w:sz="4" w:space="0"/>
-              <w:left w:val="single" w:color="000000" w:sz="4" w:space="0"/>
-              <w:bottom w:val="single" w:color="000000" w:sz="4" w:space="0"/>
-              <w:right w:val="single" w:color="000000" w:sz="4" w:space="0"/>
+              <w:top w:val="single" w:color="C4C7C5" w:sz="4" w:space="0"/>
+              <w:left w:val="single" w:color="C4C7C5" w:sz="4" w:space="0"/>
+              <w:bottom w:val="single" w:color="C4C7C5" w:sz="4" w:space="0"/>
+              <w:right w:val="single" w:color="C4C7C5" w:sz="4" w:space="0"/>
             </w:tcBorders>
-            <w:shd w:val="clear" w:color="auto" w:fill="auto"/>
+            <w:shd w:val="clear"/>
             <w:tcMar>
-              <w:top w:w="0" w:type="dxa"/>
-              <w:left w:w="108" w:type="dxa"/>
-              <w:bottom w:w="0" w:type="dxa"/>
-              <w:right w:w="108" w:type="dxa"/>
+              <w:top w:w="120" w:type="dxa"/>
+              <w:left w:w="180" w:type="dxa"/>
+              <w:bottom w:w="120" w:type="dxa"/>
+              <w:right w:w="180" w:type="dxa"/>
             </w:tcMar>
-            <w:vAlign w:val="top"/>
+            <w:vAlign w:val="center"/>
           </w:tcPr>
           <w:p>
             <w:pPr>
@@ -7451,13 +7980,15 @@
                 <w:rFonts w:hint="default" w:ascii="Arial" w:hAnsi="Arial" w:cs="Arial"/>
                 <w:sz w:val="22"/>
                 <w:szCs w:val="22"/>
-              </w:rPr>
-            </w:pPr>
-            <w:r>
-              <w:rPr>
-                <w:rFonts w:hint="default" w:ascii="Arial" w:hAnsi="Arial" w:cs="Arial"/>
-                <w:sz w:val="22"/>
-                <w:szCs w:val="22"/>
+                <w:lang w:val="en-US" w:eastAsia="zh-CN"/>
+              </w:rPr>
+            </w:pPr>
+            <w:r>
+              <w:rPr>
+                <w:rFonts w:hint="default" w:ascii="Arial" w:hAnsi="Arial" w:cs="Arial"/>
+                <w:sz w:val="22"/>
+                <w:szCs w:val="22"/>
+                <w:lang w:val="en-US" w:eastAsia="zh-CN"/>
               </w:rPr>
               <w:t>Diligence</w:t>
             </w:r>
@@ -7478,28 +8009,74 @@
                 <w:rFonts w:hint="default" w:ascii="Arial" w:hAnsi="Arial" w:cs="Arial"/>
                 <w:sz w:val="22"/>
                 <w:szCs w:val="22"/>
+                <w:lang w:val="en-US" w:eastAsia="zh-CN"/>
               </w:rPr>
               <w:t>Responsibility for your AI use</w:t>
             </w:r>
+          </w:p>
+          <w:p>
+            <w:pPr>
+              <w:bidi w:val="0"/>
+              <w:spacing w:line="240" w:lineRule="auto"/>
+              <w:jc w:val="both"/>
+              <w:rPr>
+                <w:rFonts w:hint="default" w:ascii="Arial" w:hAnsi="Arial" w:cs="Arial"/>
+                <w:sz w:val="22"/>
+                <w:szCs w:val="22"/>
+              </w:rPr>
+            </w:pPr>
+          </w:p>
+          <w:p>
+            <w:pPr>
+              <w:bidi w:val="0"/>
+              <w:spacing w:line="240" w:lineRule="auto"/>
+              <w:jc w:val="both"/>
+              <w:rPr>
+                <w:rFonts w:hint="default" w:ascii="Arial" w:hAnsi="Arial" w:cs="Arial"/>
+                <w:sz w:val="22"/>
+                <w:szCs w:val="22"/>
+              </w:rPr>
+            </w:pPr>
+            <w:r>
+              <w:rPr>
+                <w:rFonts w:hint="default" w:ascii="Arial" w:hAnsi="Arial" w:cs="Arial"/>
+                <w:sz w:val="22"/>
+                <w:szCs w:val="22"/>
+                <w:lang w:val="en-US" w:eastAsia="zh-CN"/>
+              </w:rPr>
+              <w:t>Declare all AI tools used and cite them here. Briefly outline how you considered data protection, copyright, and ethical responsibilities when choosing what to input into any AI system.</w:t>
+            </w:r>
+          </w:p>
+          <w:p>
+            <w:pPr>
+              <w:bidi w:val="0"/>
+              <w:spacing w:line="240" w:lineRule="auto"/>
+              <w:jc w:val="both"/>
+              <w:rPr>
+                <w:rFonts w:hint="default" w:ascii="Arial" w:hAnsi="Arial" w:cs="Arial"/>
+                <w:sz w:val="22"/>
+                <w:szCs w:val="22"/>
+              </w:rPr>
+            </w:pPr>
           </w:p>
         </w:tc>
         <w:tc>
           <w:tcPr>
-            <w:tcW w:w="0" w:type="auto"/>
+            <w:tcW w:w="7357" w:type="dxa"/>
             <w:tcBorders>
-              <w:top w:val="single" w:color="000000" w:sz="4" w:space="0"/>
-              <w:left w:val="single" w:color="000000" w:sz="4" w:space="0"/>
-              <w:bottom w:val="single" w:color="000000" w:sz="4" w:space="0"/>
-              <w:right w:val="single" w:color="000000" w:sz="4" w:space="0"/>
+              <w:top w:val="single" w:color="C4C7C5" w:sz="4" w:space="0"/>
+              <w:left w:val="single" w:color="C4C7C5" w:sz="4" w:space="0"/>
+              <w:bottom w:val="single" w:color="C4C7C5" w:sz="4" w:space="0"/>
+              <w:right w:val="single" w:color="C4C7C5" w:sz="4" w:space="0"/>
             </w:tcBorders>
-            <w:shd w:val="clear" w:color="auto" w:fill="auto"/>
+            <w:shd w:val="clear"/>
             <w:tcMar>
-              <w:top w:w="0" w:type="dxa"/>
-              <w:left w:w="108" w:type="dxa"/>
-              <w:bottom w:w="0" w:type="dxa"/>
-              <w:right w:w="108" w:type="dxa"/>
+              <w:top w:w="120" w:type="dxa"/>
+              <w:left w:w="180" w:type="dxa"/>
+              <w:bottom w:w="120" w:type="dxa"/>
+              <w:right w:w="180" w:type="dxa"/>
             </w:tcMar>
-            <w:vAlign w:val="top"/>
+            <w:vAlign w:val="center"/>
           </w:tcPr>
           <w:p>
             <w:pPr>
@@ -7517,210 +8094,155 @@
                 <w:rFonts w:hint="default" w:ascii="Arial" w:hAnsi="Arial" w:cs="Arial"/>
                 <w:sz w:val="22"/>
                 <w:szCs w:val="22"/>
-              </w:rPr>
-              <w:t>Declare all AI tools used and cite them here. Briefly outline how you considered data protection, copyright, and ethical responsibilities when choosing what to input into any AI system. Unauthorised use is subject to CCT disciplinary procedures.</w:t>
-            </w:r>
-          </w:p>
-        </w:tc>
-        <w:tc>
-          <w:tcPr>
-            <w:tcW w:w="0" w:type="auto"/>
-            <w:tcBorders>
-              <w:top w:val="single" w:color="000000" w:sz="4" w:space="0"/>
-              <w:left w:val="single" w:color="000000" w:sz="4" w:space="0"/>
-              <w:bottom w:val="single" w:color="000000" w:sz="4" w:space="0"/>
-              <w:right w:val="single" w:color="000000" w:sz="4" w:space="0"/>
-            </w:tcBorders>
-            <w:shd w:val="clear" w:color="auto" w:fill="auto"/>
-            <w:tcMar>
-              <w:top w:w="0" w:type="dxa"/>
-              <w:left w:w="108" w:type="dxa"/>
-              <w:bottom w:w="0" w:type="dxa"/>
-              <w:right w:w="108" w:type="dxa"/>
-            </w:tcMar>
-            <w:vAlign w:val="top"/>
-          </w:tcPr>
-          <w:p>
-            <w:pPr>
-              <w:bidi w:val="0"/>
-              <w:spacing w:line="240" w:lineRule="auto"/>
-              <w:jc w:val="both"/>
-              <w:rPr>
-                <w:rFonts w:hint="default" w:ascii="Arial" w:hAnsi="Arial" w:cs="Arial"/>
-                <w:sz w:val="22"/>
-                <w:szCs w:val="22"/>
-              </w:rPr>
-            </w:pPr>
-            <w:r>
-              <w:rPr>
-                <w:rFonts w:hint="default" w:ascii="Arial" w:hAnsi="Arial" w:cs="Arial"/>
-                <w:sz w:val="22"/>
-                <w:szCs w:val="22"/>
-              </w:rPr>
-              <w:t>Declare all AI tools used. Do not enter personal, confidential or sensitive information into AI tools. Any external sources used should be appropriately referenced.</w:t>
-            </w:r>
-          </w:p>
-          <w:p>
-            <w:pPr>
-              <w:bidi w:val="0"/>
-              <w:spacing w:line="240" w:lineRule="auto"/>
-              <w:jc w:val="both"/>
-              <w:rPr>
-                <w:rFonts w:hint="default" w:ascii="Arial" w:hAnsi="Arial" w:cs="Arial"/>
-                <w:sz w:val="22"/>
-                <w:szCs w:val="22"/>
-              </w:rPr>
-            </w:pPr>
-            <w:r>
-              <w:rPr>
-                <w:rFonts w:hint="default" w:ascii="Arial" w:hAnsi="Arial" w:cs="Arial"/>
-                <w:sz w:val="22"/>
-                <w:szCs w:val="22"/>
                 <w:lang w:val="en-US" w:eastAsia="zh-CN"/>
               </w:rPr>
+              <w:t>Declared tool:</w:t>
+            </w:r>
+          </w:p>
+          <w:p>
+            <w:pPr>
+              <w:bidi w:val="0"/>
+              <w:spacing w:line="240" w:lineRule="auto"/>
+              <w:jc w:val="both"/>
+              <w:rPr>
+                <w:rFonts w:hint="default" w:ascii="Arial" w:hAnsi="Arial" w:cs="Arial"/>
+                <w:sz w:val="22"/>
+                <w:szCs w:val="22"/>
+              </w:rPr>
+            </w:pPr>
+          </w:p>
+          <w:p>
+            <w:pPr>
+              <w:bidi w:val="0"/>
+              <w:spacing w:line="240" w:lineRule="auto"/>
+              <w:jc w:val="both"/>
+              <w:rPr>
+                <w:rFonts w:hint="default" w:ascii="Arial" w:hAnsi="Arial" w:cs="Arial"/>
+                <w:sz w:val="22"/>
+                <w:szCs w:val="22"/>
+              </w:rPr>
+            </w:pPr>
+            <w:r>
+              <w:rPr>
+                <w:rFonts w:hint="default" w:ascii="Arial" w:hAnsi="Arial" w:cs="Arial"/>
+                <w:sz w:val="22"/>
+                <w:szCs w:val="22"/>
+                <w:lang w:val="en-US" w:eastAsia="zh-CN"/>
+              </w:rPr>
+              <w:t xml:space="preserve">• Gemini (Premium version). </w:t>
+            </w:r>
+          </w:p>
+          <w:p>
+            <w:pPr>
+              <w:bidi w:val="0"/>
+              <w:spacing w:line="240" w:lineRule="auto"/>
+              <w:jc w:val="both"/>
+              <w:rPr>
+                <w:rFonts w:hint="default" w:ascii="Arial" w:hAnsi="Arial" w:cs="Arial"/>
+                <w:sz w:val="22"/>
+                <w:szCs w:val="22"/>
+              </w:rPr>
+            </w:pPr>
+            <w:r>
+              <w:rPr>
+                <w:rFonts w:hint="default" w:ascii="Arial" w:hAnsi="Arial" w:cs="Arial"/>
+                <w:sz w:val="22"/>
+                <w:szCs w:val="22"/>
+                <w:lang w:val="en-US" w:eastAsia="zh-CN"/>
+              </w:rPr>
               <w:br w:type="textWrapping"/>
             </w:r>
           </w:p>
-        </w:tc>
-        <w:tc>
-          <w:tcPr>
-            <w:tcW w:w="0" w:type="auto"/>
-            <w:tcBorders>
-              <w:top w:val="single" w:color="000000" w:sz="4" w:space="0"/>
-              <w:left w:val="single" w:color="000000" w:sz="4" w:space="0"/>
-              <w:bottom w:val="single" w:color="000000" w:sz="4" w:space="0"/>
-              <w:right w:val="single" w:color="000000" w:sz="4" w:space="0"/>
-            </w:tcBorders>
-            <w:shd w:val="clear" w:color="auto" w:fill="auto"/>
-            <w:tcMar>
-              <w:top w:w="0" w:type="dxa"/>
-              <w:left w:w="108" w:type="dxa"/>
-              <w:bottom w:w="0" w:type="dxa"/>
-              <w:right w:w="108" w:type="dxa"/>
-            </w:tcMar>
-            <w:vAlign w:val="top"/>
-          </w:tcPr>
-          <w:p>
-            <w:pPr>
-              <w:bidi w:val="0"/>
-              <w:spacing w:line="240" w:lineRule="auto"/>
-              <w:jc w:val="both"/>
-              <w:rPr>
-                <w:rFonts w:hint="default" w:ascii="Arial" w:hAnsi="Arial" w:cs="Arial"/>
-                <w:sz w:val="22"/>
-                <w:szCs w:val="22"/>
-              </w:rPr>
-            </w:pPr>
-            <w:r>
-              <w:rPr>
-                <w:rFonts w:hint="default" w:ascii="Arial" w:hAnsi="Arial" w:cs="Arial"/>
-                <w:sz w:val="22"/>
-                <w:szCs w:val="22"/>
-              </w:rPr>
-              <w:t>List the AI tools used and briefly explain how you used them responsibly.</w:t>
+          <w:p>
+            <w:pPr>
+              <w:bidi w:val="0"/>
+              <w:spacing w:line="240" w:lineRule="auto"/>
+              <w:jc w:val="both"/>
+              <w:rPr>
+                <w:rFonts w:hint="default" w:ascii="Arial" w:hAnsi="Arial" w:cs="Arial"/>
+                <w:sz w:val="22"/>
+                <w:szCs w:val="22"/>
+              </w:rPr>
+            </w:pPr>
+            <w:r>
+              <w:rPr>
+                <w:rFonts w:hint="default" w:ascii="Arial" w:hAnsi="Arial" w:cs="Arial"/>
+                <w:sz w:val="22"/>
+                <w:szCs w:val="22"/>
+                <w:lang w:val="en-US" w:eastAsia="zh-CN"/>
+              </w:rPr>
+              <w:t>Data protection and ethics:</w:t>
+            </w:r>
+          </w:p>
+          <w:p>
+            <w:pPr>
+              <w:bidi w:val="0"/>
+              <w:spacing w:line="240" w:lineRule="auto"/>
+              <w:jc w:val="both"/>
+              <w:rPr>
+                <w:rFonts w:hint="default" w:ascii="Arial" w:hAnsi="Arial" w:cs="Arial"/>
+                <w:sz w:val="22"/>
+                <w:szCs w:val="22"/>
+              </w:rPr>
+            </w:pPr>
+          </w:p>
+          <w:p>
+            <w:pPr>
+              <w:bidi w:val="0"/>
+              <w:spacing w:line="240" w:lineRule="auto"/>
+              <w:jc w:val="both"/>
+              <w:rPr>
+                <w:rFonts w:hint="default" w:ascii="Arial" w:hAnsi="Arial" w:cs="Arial"/>
+                <w:sz w:val="22"/>
+                <w:szCs w:val="22"/>
+              </w:rPr>
+            </w:pPr>
+            <w:r>
+              <w:rPr>
+                <w:rFonts w:hint="default" w:ascii="Arial" w:hAnsi="Arial" w:cs="Arial"/>
+                <w:sz w:val="22"/>
+                <w:szCs w:val="22"/>
+                <w:lang w:val="en-US" w:eastAsia="zh-CN"/>
+              </w:rPr>
+              <w:t xml:space="preserve">• All information entered into the tool was original content authored by the user (such as audio recordings or Spanish text) or consisted of open, public data available on the web (such as databases). </w:t>
+            </w:r>
+          </w:p>
+          <w:p>
+            <w:pPr>
+              <w:bidi w:val="0"/>
+              <w:spacing w:line="240" w:lineRule="auto"/>
+              <w:jc w:val="both"/>
+              <w:rPr>
+                <w:rFonts w:hint="default" w:ascii="Arial" w:hAnsi="Arial" w:cs="Arial"/>
+                <w:sz w:val="22"/>
+                <w:szCs w:val="22"/>
+              </w:rPr>
+            </w:pPr>
+          </w:p>
+          <w:p>
+            <w:pPr>
+              <w:bidi w:val="0"/>
+              <w:spacing w:line="240" w:lineRule="auto"/>
+              <w:jc w:val="both"/>
+              <w:rPr>
+                <w:rFonts w:hint="default" w:ascii="Arial" w:hAnsi="Arial" w:cs="Arial"/>
+                <w:sz w:val="22"/>
+                <w:szCs w:val="22"/>
+              </w:rPr>
+            </w:pPr>
+            <w:r>
+              <w:rPr>
+                <w:rFonts w:hint="default" w:ascii="Arial" w:hAnsi="Arial" w:cs="Arial"/>
+                <w:sz w:val="22"/>
+                <w:szCs w:val="22"/>
+                <w:lang w:val="en-US" w:eastAsia="zh-CN"/>
+              </w:rPr>
+              <w:t xml:space="preserve">• Consequently, the processed data required no special data protection protocols and did not infringe on intellectual property rights. </w:t>
             </w:r>
           </w:p>
         </w:tc>
       </w:tr>
     </w:tbl>
-    <w:p>
-      <w:pPr>
-        <w:bidi w:val="0"/>
-        <w:spacing w:line="240" w:lineRule="auto"/>
-        <w:jc w:val="both"/>
-        <w:rPr>
-          <w:rFonts w:hint="default" w:ascii="Arial" w:hAnsi="Arial" w:cs="Arial"/>
-          <w:sz w:val="22"/>
-          <w:szCs w:val="22"/>
-        </w:rPr>
-      </w:pPr>
-    </w:p>
-    <w:p>
-      <w:pPr>
-        <w:bidi w:val="0"/>
-        <w:spacing w:line="240" w:lineRule="auto"/>
-        <w:jc w:val="both"/>
-        <w:rPr>
-          <w:rFonts w:hint="default" w:ascii="Arial" w:hAnsi="Arial" w:cs="Arial"/>
-          <w:sz w:val="22"/>
-          <w:szCs w:val="22"/>
-        </w:rPr>
-      </w:pPr>
-      <w:r>
-        <w:rPr>
-          <w:rFonts w:hint="default" w:ascii="Arial" w:hAnsi="Arial" w:cs="Arial"/>
-          <w:sz w:val="22"/>
-          <w:szCs w:val="22"/>
-        </w:rPr>
-        <w:t xml:space="preserve">Adapted from the </w:t>
-      </w:r>
-      <w:r>
-        <w:rPr>
-          <w:rFonts w:hint="default" w:ascii="Arial" w:hAnsi="Arial" w:cs="Arial"/>
-          <w:sz w:val="22"/>
-          <w:szCs w:val="22"/>
-        </w:rPr>
-        <w:fldChar w:fldCharType="begin"/>
-      </w:r>
-      <w:r>
-        <w:rPr>
-          <w:rFonts w:hint="default" w:ascii="Arial" w:hAnsi="Arial" w:cs="Arial"/>
-          <w:sz w:val="22"/>
-          <w:szCs w:val="22"/>
-        </w:rPr>
-        <w:instrText xml:space="preserve"> HYPERLINK "https://anthropic.skilljar.com/teaching-ai-fluency" </w:instrText>
-      </w:r>
-      <w:r>
-        <w:rPr>
-          <w:rFonts w:hint="default" w:ascii="Arial" w:hAnsi="Arial" w:cs="Arial"/>
-          <w:sz w:val="22"/>
-          <w:szCs w:val="22"/>
-        </w:rPr>
-        <w:fldChar w:fldCharType="separate"/>
-      </w:r>
-      <w:r>
-        <w:rPr>
-          <w:rStyle w:val="18"/>
-          <w:rFonts w:hint="default" w:ascii="Arial" w:hAnsi="Arial" w:cs="Arial"/>
-          <w:i/>
-          <w:iCs/>
-          <w:color w:val="1155CC"/>
-          <w:sz w:val="22"/>
-          <w:szCs w:val="22"/>
-          <w:u w:val="single"/>
-          <w:vertAlign w:val="baseline"/>
-        </w:rPr>
-        <w:t>AI Fluency Framework</w:t>
-      </w:r>
-      <w:r>
-        <w:rPr>
-          <w:rFonts w:hint="default" w:ascii="Arial" w:hAnsi="Arial" w:cs="Arial"/>
-          <w:sz w:val="22"/>
-          <w:szCs w:val="22"/>
-        </w:rPr>
-        <w:fldChar w:fldCharType="end"/>
-      </w:r>
-      <w:r>
-        <w:rPr>
-          <w:rFonts w:hint="default" w:ascii="Arial" w:hAnsi="Arial" w:cs="Arial"/>
-          <w:sz w:val="22"/>
-          <w:szCs w:val="22"/>
-        </w:rPr>
-        <w:t xml:space="preserve"> (Dakan, Feller, Anthropic, 2025</w:t>
-      </w:r>
-    </w:p>
-    <w:p>
-      <w:pPr>
-        <w:bidi w:val="0"/>
-        <w:spacing w:line="240" w:lineRule="auto"/>
-        <w:jc w:val="both"/>
-        <w:rPr>
-          <w:rFonts w:hint="default" w:ascii="Arial" w:hAnsi="Arial" w:cs="Arial"/>
-          <w:sz w:val="22"/>
-          <w:szCs w:val="22"/>
-        </w:rPr>
-      </w:pPr>
-    </w:p>
     <w:p>
       <w:pPr>
         <w:bidi w:val="0"/>

</xml_diff>